<commit_message>
Knowledge - 8/3/2026 part 1
</commit_message>
<xml_diff>
--- a/Knowledge/2-Science/1-Formal sciences/1-Mathematics/3-Pure Mathematics/1-Quantity/1-Arithmetic/5-My Source/1-Arithmetic Basics/13-Number Line.docx
+++ b/Knowledge/2-Science/1-Formal sciences/1-Mathematics/3-Pure Mathematics/1-Quantity/1-Arithmetic/5-My Source/1-Arithmetic Basics/13-Number Line.docx
@@ -1,6 +1,6 @@
 
 <file path=word/document.xml><?xml version="1.0" encoding="utf-8"?>
-<w:document xmlns:wpc="http://schemas.microsoft.com/office/word/2010/wordprocessingCanvas" xmlns:cx="http://schemas.microsoft.com/office/drawing/2014/chartex" xmlns:cx1="http://schemas.microsoft.com/office/drawing/2015/9/8/chartex" xmlns:cx2="http://schemas.microsoft.com/office/drawing/2015/10/21/chartex" xmlns:cx3="http://schemas.microsoft.com/office/drawing/2016/5/9/chartex" xmlns:cx4="http://schemas.microsoft.com/office/drawing/2016/5/10/chartex" xmlns:cx5="http://schemas.microsoft.com/office/drawing/2016/5/11/chartex" xmlns:cx6="http://schemas.microsoft.com/office/drawing/2016/5/12/chartex" xmlns:cx7="http://schemas.microsoft.com/office/drawing/2016/5/13/chartex" xmlns:cx8="http://schemas.microsoft.com/office/drawing/2016/5/14/chartex" xmlns:mc="http://schemas.openxmlformats.org/markup-compatibility/2006" xmlns:aink="http://schemas.microsoft.com/office/drawing/2016/ink" xmlns:am3d="http://schemas.microsoft.com/office/drawing/2017/model3d" xmlns:o="urn:schemas-microsoft-com:office:office" xmlns:oel="http://schemas.microsoft.com/office/2019/extlst" xmlns:r="http://schemas.openxmlformats.org/officeDocument/2006/relationships" xmlns:m="http://schemas.openxmlformats.org/officeDocument/2006/math" xmlns:v="urn:schemas-microsoft-com:vml" xmlns:wp14="http://schemas.microsoft.com/office/word/2010/wordprocessingDrawing" xmlns:wp="http://schemas.openxmlformats.org/drawingml/2006/wordprocessingDrawing" xmlns:w10="urn:schemas-microsoft-com:office:word" xmlns:w="http://schemas.openxmlformats.org/wordprocessingml/2006/main" xmlns:w14="http://schemas.microsoft.com/office/word/2010/wordml" xmlns:w15="http://schemas.microsoft.com/office/word/2012/wordml" xmlns:w16cex="http://schemas.microsoft.com/office/word/2018/wordml/cex" xmlns:w16cid="http://schemas.microsoft.com/office/word/2016/wordml/cid" xmlns:w16="http://schemas.microsoft.com/office/word/2018/wordml" xmlns:w16du="http://schemas.microsoft.com/office/word/2023/wordml/word16du" xmlns:w16sdtdh="http://schemas.microsoft.com/office/word/2020/wordml/sdtdatahash" xmlns:w16sdtfl="http://schemas.microsoft.com/office/word/2024/wordml/sdtformatlock" xmlns:w16se="http://schemas.microsoft.com/office/word/2015/wordml/symex" xmlns:wpg="http://schemas.microsoft.com/office/word/2010/wordprocessingGroup" xmlns:wpi="http://schemas.microsoft.com/office/word/2010/wordprocessingInk" xmlns:wne="http://schemas.microsoft.com/office/word/2006/wordml" xmlns:wps="http://schemas.microsoft.com/office/word/2010/wordprocessingShape" mc:Ignorable="w14 w15 w16se w16cid w16 w16cex w16sdtdh w16sdtfl w16du wp14">
+<w:document xmlns:wpc="http://schemas.microsoft.com/office/word/2010/wordprocessingCanvas" xmlns:cx="http://schemas.microsoft.com/office/drawing/2014/chartex" xmlns:cx1="http://schemas.microsoft.com/office/drawing/2015/9/8/chartex" xmlns:cx2="http://schemas.microsoft.com/office/drawing/2015/10/21/chartex" xmlns:cx3="http://schemas.microsoft.com/office/drawing/2016/5/9/chartex" xmlns:cx4="http://schemas.microsoft.com/office/drawing/2016/5/10/chartex" xmlns:cx5="http://schemas.microsoft.com/office/drawing/2016/5/11/chartex" xmlns:cx6="http://schemas.microsoft.com/office/drawing/2016/5/12/chartex" xmlns:cx7="http://schemas.microsoft.com/office/drawing/2016/5/13/chartex" xmlns:cx8="http://schemas.microsoft.com/office/drawing/2016/5/14/chartex" xmlns:mc="http://schemas.openxmlformats.org/markup-compatibility/2006" xmlns:aink="http://schemas.microsoft.com/office/drawing/2016/ink" xmlns:am3d="http://schemas.microsoft.com/office/drawing/2017/model3d" xmlns:o="urn:schemas-microsoft-com:office:office" xmlns:oel="http://schemas.microsoft.com/office/2019/extlst" xmlns:r="http://schemas.openxmlformats.org/officeDocument/2006/relationships" xmlns:m="http://schemas.openxmlformats.org/officeDocument/2006/math" xmlns:v="urn:schemas-microsoft-com:vml" xmlns:wp14="http://schemas.microsoft.com/office/word/2010/wordprocessingDrawing" xmlns:wp="http://schemas.openxmlformats.org/drawingml/2006/wordprocessingDrawing" xmlns:w10="urn:schemas-microsoft-com:office:word" xmlns:w="http://schemas.openxmlformats.org/wordprocessingml/2006/main" xmlns:w14="http://schemas.microsoft.com/office/word/2010/wordml" xmlns:w15="http://schemas.microsoft.com/office/word/2012/wordml" xmlns:w16cei="http://schemas.microsoft.com/office/word/2026/wordml/cei" xmlns:w16cex="http://schemas.microsoft.com/office/word/2018/wordml/cex" xmlns:w16cid="http://schemas.microsoft.com/office/word/2016/wordml/cid" xmlns:w16="http://schemas.microsoft.com/office/word/2018/wordml" xmlns:w16du="http://schemas.microsoft.com/office/word/2023/wordml/word16du" xmlns:w16sdtdh="http://schemas.microsoft.com/office/word/2020/wordml/sdtdatahash" xmlns:w16sdtfl="http://schemas.microsoft.com/office/word/2024/wordml/sdtformatlock" xmlns:w16se="http://schemas.microsoft.com/office/word/2015/wordml/symex" xmlns:wpg="http://schemas.microsoft.com/office/word/2010/wordprocessingGroup" xmlns:wpi="http://schemas.microsoft.com/office/word/2010/wordprocessingInk" xmlns:wne="http://schemas.microsoft.com/office/word/2006/wordml" xmlns:wps="http://schemas.microsoft.com/office/word/2010/wordprocessingShape" mc:Ignorable="w14 w15 w16se w16cid w16 w16cex w16sdtdh w16sdtfl w16du wp14">
   <w:body>
     <w:p>
       <w:pPr>
@@ -33,7 +33,27 @@
           <w:sz w:val="18"/>
           <w:highlight w:val="lightGray"/>
         </w:rPr>
-        <w:t xml:space="preserve">: Persons Table -&gt; ID Column: 1, Name_En Column: Motasem Essam] -&gt; </w:t>
+        <w:t xml:space="preserve">: Persons Table -&gt; ID Column: 1, </w:t>
+      </w:r>
+      <w:proofErr w:type="spellStart"/>
+      <w:r>
+        <w:rPr>
+          <w:rFonts w:ascii="Arial" w:eastAsia="Arial" w:hAnsi="Arial" w:cs="Arial"/>
+          <w:color w:val="000000"/>
+          <w:sz w:val="18"/>
+          <w:highlight w:val="lightGray"/>
+        </w:rPr>
+        <w:t>Name_En</w:t>
+      </w:r>
+      <w:proofErr w:type="spellEnd"/>
+      <w:r>
+        <w:rPr>
+          <w:rFonts w:ascii="Arial" w:eastAsia="Arial" w:hAnsi="Arial" w:cs="Arial"/>
+          <w:color w:val="000000"/>
+          <w:sz w:val="18"/>
+          <w:highlight w:val="lightGray"/>
+        </w:rPr>
+        <w:t xml:space="preserve"> Column: Motasem Essam] -&gt; </w:t>
       </w:r>
       <w:r>
         <w:rPr>
@@ -71,7 +91,7 @@
           <w:sz w:val="18"/>
           <w:highlight w:val="lightGray"/>
         </w:rPr>
-        <w:t xml:space="preserve"> [7/15/2026]</w:t>
+        <w:t xml:space="preserve"> [7/11/2026]</w:t>
       </w:r>
     </w:p>
     <w:p>
@@ -125,7 +145,7 @@
           <w:rFonts w:ascii="Roboto Mono" w:hAnsi="Roboto Mono"/>
         </w:rPr>
         <w:pict w14:anchorId="3F0F929B">
-          <v:rect id="_x0000_i1229" style="width:0;height:1.5pt" o:hralign="center" o:hrstd="t" o:hr="t" fillcolor="#a0a0a0" stroked="f"/>
+          <v:rect id="_x0000_i1025" style="width:0;height:1.5pt" o:hralign="center" o:hrstd="t" o:hr="t" fillcolor="#a0a0a0" stroked="f"/>
         </w:pict>
       </w:r>
     </w:p>
@@ -155,7 +175,27 @@
           <w:sz w:val="18"/>
           <w:highlight w:val="lightGray"/>
         </w:rPr>
-        <w:t xml:space="preserve">: Persons Table -&gt; ID Column: 1, Name_En Column: Motasem Essam] -&gt; </w:t>
+        <w:t xml:space="preserve">: Persons Table -&gt; ID Column: 1, </w:t>
+      </w:r>
+      <w:proofErr w:type="spellStart"/>
+      <w:r>
+        <w:rPr>
+          <w:rFonts w:ascii="Arial" w:eastAsia="Arial" w:hAnsi="Arial" w:cs="Arial"/>
+          <w:color w:val="000000"/>
+          <w:sz w:val="18"/>
+          <w:highlight w:val="lightGray"/>
+        </w:rPr>
+        <w:t>Name_En</w:t>
+      </w:r>
+      <w:proofErr w:type="spellEnd"/>
+      <w:r>
+        <w:rPr>
+          <w:rFonts w:ascii="Arial" w:eastAsia="Arial" w:hAnsi="Arial" w:cs="Arial"/>
+          <w:color w:val="000000"/>
+          <w:sz w:val="18"/>
+          <w:highlight w:val="lightGray"/>
+        </w:rPr>
+        <w:t xml:space="preserve"> Column: Motasem Essam] -&gt; </w:t>
       </w:r>
       <w:r>
         <w:rPr>
@@ -193,7 +233,7 @@
           <w:sz w:val="18"/>
           <w:highlight w:val="lightGray"/>
         </w:rPr>
-        <w:t xml:space="preserve"> [7/15/2026]</w:t>
+        <w:t xml:space="preserve"> [7/11/2026]</w:t>
       </w:r>
     </w:p>
     <w:p>
@@ -275,7 +315,7 @@
           <w:rFonts w:ascii="Roboto Mono" w:hAnsi="Roboto Mono"/>
         </w:rPr>
         <w:pict w14:anchorId="53781CCC">
-          <v:rect id="_x0000_i1230" style="width:0;height:1.5pt" o:hralign="center" o:hrstd="t" o:hr="t" fillcolor="#a0a0a0" stroked="f"/>
+          <v:rect id="_x0000_i1026" style="width:0;height:1.5pt" o:hralign="center" o:hrstd="t" o:hr="t" fillcolor="#a0a0a0" stroked="f"/>
         </w:pict>
       </w:r>
     </w:p>
@@ -312,7 +352,27 @@
           <w:sz w:val="18"/>
           <w:highlight w:val="lightGray"/>
         </w:rPr>
-        <w:t xml:space="preserve">: Persons Table -&gt; ID Column: 1, Name_En Column: Motasem Essam] -&gt; </w:t>
+        <w:t xml:space="preserve">: Persons Table -&gt; ID Column: 1, </w:t>
+      </w:r>
+      <w:proofErr w:type="spellStart"/>
+      <w:r>
+        <w:rPr>
+          <w:rFonts w:ascii="Arial" w:eastAsia="Arial" w:hAnsi="Arial" w:cs="Arial"/>
+          <w:color w:val="000000"/>
+          <w:sz w:val="18"/>
+          <w:highlight w:val="lightGray"/>
+        </w:rPr>
+        <w:t>Name_En</w:t>
+      </w:r>
+      <w:proofErr w:type="spellEnd"/>
+      <w:r>
+        <w:rPr>
+          <w:rFonts w:ascii="Arial" w:eastAsia="Arial" w:hAnsi="Arial" w:cs="Arial"/>
+          <w:color w:val="000000"/>
+          <w:sz w:val="18"/>
+          <w:highlight w:val="lightGray"/>
+        </w:rPr>
+        <w:t xml:space="preserve"> Column: Motasem Essam] -&gt; </w:t>
       </w:r>
       <w:r>
         <w:rPr>
@@ -350,7 +410,7 @@
           <w:sz w:val="18"/>
           <w:highlight w:val="lightGray"/>
         </w:rPr>
-        <w:t xml:space="preserve"> [7/15/2026]</w:t>
+        <w:t xml:space="preserve"> [7/11/2026]</w:t>
       </w:r>
     </w:p>
     <w:p>
@@ -453,7 +513,7 @@
           <w:rFonts w:ascii="Roboto Mono" w:hAnsi="Roboto Mono"/>
         </w:rPr>
         <w:pict w14:anchorId="41F5ABCE">
-          <v:rect id="_x0000_i1231" style="width:0;height:1.5pt" o:hralign="center" o:hrstd="t" o:hr="t" fillcolor="#a0a0a0" stroked="f"/>
+          <v:rect id="_x0000_i1027" style="width:0;height:1.5pt" o:hralign="center" o:hrstd="t" o:hr="t" fillcolor="#a0a0a0" stroked="f"/>
         </w:pict>
       </w:r>
     </w:p>
@@ -483,7 +543,27 @@
           <w:sz w:val="18"/>
           <w:highlight w:val="lightGray"/>
         </w:rPr>
-        <w:t xml:space="preserve">: Persons Table -&gt; ID Column: 1, Name_En Column: Motasem Essam] -&gt; </w:t>
+        <w:t xml:space="preserve">: Persons Table -&gt; ID Column: 1, </w:t>
+      </w:r>
+      <w:proofErr w:type="spellStart"/>
+      <w:r>
+        <w:rPr>
+          <w:rFonts w:ascii="Arial" w:eastAsia="Arial" w:hAnsi="Arial" w:cs="Arial"/>
+          <w:color w:val="000000"/>
+          <w:sz w:val="18"/>
+          <w:highlight w:val="lightGray"/>
+        </w:rPr>
+        <w:t>Name_En</w:t>
+      </w:r>
+      <w:proofErr w:type="spellEnd"/>
+      <w:r>
+        <w:rPr>
+          <w:rFonts w:ascii="Arial" w:eastAsia="Arial" w:hAnsi="Arial" w:cs="Arial"/>
+          <w:color w:val="000000"/>
+          <w:sz w:val="18"/>
+          <w:highlight w:val="lightGray"/>
+        </w:rPr>
+        <w:t xml:space="preserve"> Column: Motasem Essam] -&gt; </w:t>
       </w:r>
       <w:r>
         <w:rPr>
@@ -521,7 +601,7 @@
           <w:sz w:val="18"/>
           <w:highlight w:val="lightGray"/>
         </w:rPr>
-        <w:t xml:space="preserve"> [7/15/2026]</w:t>
+        <w:t xml:space="preserve"> [7/11/2026]</w:t>
       </w:r>
     </w:p>
     <w:p>
@@ -650,7 +730,7 @@
           <w:rFonts w:ascii="Roboto Mono" w:hAnsi="Roboto Mono"/>
         </w:rPr>
         <w:pict w14:anchorId="08CCD4AE">
-          <v:rect id="_x0000_i1232" style="width:0;height:1.5pt" o:hralign="center" o:hrstd="t" o:hr="t" fillcolor="#a0a0a0" stroked="f"/>
+          <v:rect id="_x0000_i1028" style="width:0;height:1.5pt" o:hralign="center" o:hrstd="t" o:hr="t" fillcolor="#a0a0a0" stroked="f"/>
         </w:pict>
       </w:r>
     </w:p>
@@ -680,7 +760,27 @@
           <w:sz w:val="18"/>
           <w:highlight w:val="lightGray"/>
         </w:rPr>
-        <w:t xml:space="preserve">: Persons Table -&gt; ID Column: 1, Name_En Column: Motasem Essam] -&gt; </w:t>
+        <w:t xml:space="preserve">: Persons Table -&gt; ID Column: 1, </w:t>
+      </w:r>
+      <w:proofErr w:type="spellStart"/>
+      <w:r>
+        <w:rPr>
+          <w:rFonts w:ascii="Arial" w:eastAsia="Arial" w:hAnsi="Arial" w:cs="Arial"/>
+          <w:color w:val="000000"/>
+          <w:sz w:val="18"/>
+          <w:highlight w:val="lightGray"/>
+        </w:rPr>
+        <w:t>Name_En</w:t>
+      </w:r>
+      <w:proofErr w:type="spellEnd"/>
+      <w:r>
+        <w:rPr>
+          <w:rFonts w:ascii="Arial" w:eastAsia="Arial" w:hAnsi="Arial" w:cs="Arial"/>
+          <w:color w:val="000000"/>
+          <w:sz w:val="18"/>
+          <w:highlight w:val="lightGray"/>
+        </w:rPr>
+        <w:t xml:space="preserve"> Column: Motasem Essam] -&gt; </w:t>
       </w:r>
       <w:r>
         <w:rPr>
@@ -718,7 +818,7 @@
           <w:sz w:val="18"/>
           <w:highlight w:val="lightGray"/>
         </w:rPr>
-        <w:t xml:space="preserve"> [7/15/2026]</w:t>
+        <w:t xml:space="preserve"> [7/11/2026]</w:t>
       </w:r>
     </w:p>
     <w:p>
@@ -760,6 +860,9 @@
             </m:e>
           </m:borderBox>
           <m:r>
+            <m:rPr>
+              <m:sty m:val="p"/>
+            </m:rPr>
             <w:rPr>
               <w:rFonts w:ascii="Roboto Mono" w:hAnsi="Roboto Mono"/>
             </w:rPr>
@@ -853,7 +956,7 @@
           <w:rFonts w:ascii="Roboto Mono" w:hAnsi="Roboto Mono"/>
         </w:rPr>
         <w:pict w14:anchorId="3507DEB2">
-          <v:rect id="_x0000_i1233" style="width:0;height:1.5pt" o:hralign="center" o:hrstd="t" o:hr="t" fillcolor="#a0a0a0" stroked="f"/>
+          <v:rect id="_x0000_i1029" style="width:0;height:1.5pt" o:hralign="center" o:hrstd="t" o:hr="t" fillcolor="#a0a0a0" stroked="f"/>
         </w:pict>
       </w:r>
     </w:p>
@@ -883,7 +986,27 @@
           <w:sz w:val="18"/>
           <w:highlight w:val="lightGray"/>
         </w:rPr>
-        <w:t xml:space="preserve">: Persons Table -&gt; ID Column: 1, Name_En Column: Motasem Essam] -&gt; </w:t>
+        <w:t xml:space="preserve">: Persons Table -&gt; ID Column: 1, </w:t>
+      </w:r>
+      <w:proofErr w:type="spellStart"/>
+      <w:r>
+        <w:rPr>
+          <w:rFonts w:ascii="Arial" w:eastAsia="Arial" w:hAnsi="Arial" w:cs="Arial"/>
+          <w:color w:val="000000"/>
+          <w:sz w:val="18"/>
+          <w:highlight w:val="lightGray"/>
+        </w:rPr>
+        <w:t>Name_En</w:t>
+      </w:r>
+      <w:proofErr w:type="spellEnd"/>
+      <w:r>
+        <w:rPr>
+          <w:rFonts w:ascii="Arial" w:eastAsia="Arial" w:hAnsi="Arial" w:cs="Arial"/>
+          <w:color w:val="000000"/>
+          <w:sz w:val="18"/>
+          <w:highlight w:val="lightGray"/>
+        </w:rPr>
+        <w:t xml:space="preserve"> Column: Motasem Essam] -&gt; </w:t>
       </w:r>
       <w:r>
         <w:rPr>
@@ -921,7 +1044,7 @@
           <w:sz w:val="18"/>
           <w:highlight w:val="lightGray"/>
         </w:rPr>
-        <w:t xml:space="preserve"> [7/15/2026]</w:t>
+        <w:t xml:space="preserve"> [7/11/2026]</w:t>
       </w:r>
     </w:p>
     <w:p>
@@ -1042,7 +1165,6 @@
           <m:r>
             <w:rPr>
               <w:rFonts w:ascii="Roboto Mono" w:hAnsi="Roboto Mono"/>
-              <w:i/>
             </w:rPr>
             <w:br/>
           </m:r>
@@ -1060,7 +1182,7 @@
           <w:rFonts w:ascii="Roboto Mono" w:hAnsi="Roboto Mono"/>
         </w:rPr>
         <w:pict w14:anchorId="09F71115">
-          <v:rect id="_x0000_i1234" style="width:0;height:1.5pt" o:hralign="center" o:hrstd="t" o:hr="t" fillcolor="#a0a0a0" stroked="f"/>
+          <v:rect id="_x0000_i1030" style="width:0;height:1.5pt" o:hralign="center" o:hrstd="t" o:hr="t" fillcolor="#a0a0a0" stroked="f"/>
         </w:pict>
       </w:r>
     </w:p>
@@ -1090,7 +1212,27 @@
           <w:sz w:val="18"/>
           <w:highlight w:val="lightGray"/>
         </w:rPr>
-        <w:t xml:space="preserve">: Persons Table -&gt; ID Column: 1, Name_En Column: Motasem Essam] -&gt; </w:t>
+        <w:t xml:space="preserve">: Persons Table -&gt; ID Column: 1, </w:t>
+      </w:r>
+      <w:proofErr w:type="spellStart"/>
+      <w:r>
+        <w:rPr>
+          <w:rFonts w:ascii="Arial" w:eastAsia="Arial" w:hAnsi="Arial" w:cs="Arial"/>
+          <w:color w:val="000000"/>
+          <w:sz w:val="18"/>
+          <w:highlight w:val="lightGray"/>
+        </w:rPr>
+        <w:t>Name_En</w:t>
+      </w:r>
+      <w:proofErr w:type="spellEnd"/>
+      <w:r>
+        <w:rPr>
+          <w:rFonts w:ascii="Arial" w:eastAsia="Arial" w:hAnsi="Arial" w:cs="Arial"/>
+          <w:color w:val="000000"/>
+          <w:sz w:val="18"/>
+          <w:highlight w:val="lightGray"/>
+        </w:rPr>
+        <w:t xml:space="preserve"> Column: Motasem Essam] -&gt; </w:t>
       </w:r>
       <w:r>
         <w:rPr>
@@ -1128,7 +1270,7 @@
           <w:sz w:val="18"/>
           <w:highlight w:val="lightGray"/>
         </w:rPr>
-        <w:t xml:space="preserve"> [7/15/2026]</w:t>
+        <w:t xml:space="preserve"> [7/11/2026]</w:t>
       </w:r>
     </w:p>
     <w:p>
@@ -1233,7 +1375,6 @@
           <m:r>
             <w:rPr>
               <w:rFonts w:ascii="Roboto Mono" w:hAnsi="Roboto Mono"/>
-              <w:i/>
             </w:rPr>
             <w:br/>
           </m:r>
@@ -1251,7 +1392,7 @@
           <w:rFonts w:ascii="Roboto Mono" w:hAnsi="Roboto Mono"/>
         </w:rPr>
         <w:pict w14:anchorId="665711DE">
-          <v:rect id="_x0000_i1235" style="width:0;height:1.5pt" o:hralign="center" o:hrstd="t" o:hr="t" fillcolor="#a0a0a0" stroked="f"/>
+          <v:rect id="_x0000_i1031" style="width:0;height:1.5pt" o:hralign="center" o:hrstd="t" o:hr="t" fillcolor="#a0a0a0" stroked="f"/>
         </w:pict>
       </w:r>
     </w:p>
@@ -1281,7 +1422,27 @@
           <w:sz w:val="18"/>
           <w:highlight w:val="lightGray"/>
         </w:rPr>
-        <w:t xml:space="preserve">: Persons Table -&gt; ID Column: 1, Name_En Column: Motasem Essam] -&gt; </w:t>
+        <w:t xml:space="preserve">: Persons Table -&gt; ID Column: 1, </w:t>
+      </w:r>
+      <w:proofErr w:type="spellStart"/>
+      <w:r>
+        <w:rPr>
+          <w:rFonts w:ascii="Arial" w:eastAsia="Arial" w:hAnsi="Arial" w:cs="Arial"/>
+          <w:color w:val="000000"/>
+          <w:sz w:val="18"/>
+          <w:highlight w:val="lightGray"/>
+        </w:rPr>
+        <w:t>Name_En</w:t>
+      </w:r>
+      <w:proofErr w:type="spellEnd"/>
+      <w:r>
+        <w:rPr>
+          <w:rFonts w:ascii="Arial" w:eastAsia="Arial" w:hAnsi="Arial" w:cs="Arial"/>
+          <w:color w:val="000000"/>
+          <w:sz w:val="18"/>
+          <w:highlight w:val="lightGray"/>
+        </w:rPr>
+        <w:t xml:space="preserve"> Column: Motasem Essam] -&gt; </w:t>
       </w:r>
       <w:r>
         <w:rPr>
@@ -1319,7 +1480,7 @@
           <w:sz w:val="18"/>
           <w:highlight w:val="lightGray"/>
         </w:rPr>
-        <w:t xml:space="preserve"> [7/15/2026]</w:t>
+        <w:t xml:space="preserve"> [7/11/2026]</w:t>
       </w:r>
     </w:p>
     <w:p>
@@ -1404,7 +1565,7 @@
           <w:rFonts w:ascii="Roboto Mono" w:hAnsi="Roboto Mono"/>
         </w:rPr>
         <w:pict w14:anchorId="3555572D">
-          <v:rect id="_x0000_i1236" style="width:0;height:1.5pt" o:hralign="center" o:hrstd="t" o:hr="t" fillcolor="#a0a0a0" stroked="f"/>
+          <v:rect id="_x0000_i1032" style="width:0;height:1.5pt" o:hralign="center" o:hrstd="t" o:hr="t" fillcolor="#a0a0a0" stroked="f"/>
         </w:pict>
       </w:r>
     </w:p>
@@ -1434,7 +1595,27 @@
           <w:sz w:val="18"/>
           <w:highlight w:val="lightGray"/>
         </w:rPr>
-        <w:t xml:space="preserve">: Persons Table -&gt; ID Column: 1, Name_En Column: Motasem Essam] -&gt; </w:t>
+        <w:t xml:space="preserve">: Persons Table -&gt; ID Column: 1, </w:t>
+      </w:r>
+      <w:proofErr w:type="spellStart"/>
+      <w:r>
+        <w:rPr>
+          <w:rFonts w:ascii="Arial" w:eastAsia="Arial" w:hAnsi="Arial" w:cs="Arial"/>
+          <w:color w:val="000000"/>
+          <w:sz w:val="18"/>
+          <w:highlight w:val="lightGray"/>
+        </w:rPr>
+        <w:t>Name_En</w:t>
+      </w:r>
+      <w:proofErr w:type="spellEnd"/>
+      <w:r>
+        <w:rPr>
+          <w:rFonts w:ascii="Arial" w:eastAsia="Arial" w:hAnsi="Arial" w:cs="Arial"/>
+          <w:color w:val="000000"/>
+          <w:sz w:val="18"/>
+          <w:highlight w:val="lightGray"/>
+        </w:rPr>
+        <w:t xml:space="preserve"> Column: Motasem Essam] -&gt; </w:t>
       </w:r>
       <w:r>
         <w:rPr>
@@ -1472,7 +1653,7 @@
           <w:sz w:val="18"/>
           <w:highlight w:val="lightGray"/>
         </w:rPr>
-        <w:t xml:space="preserve"> [7/15/2026]</w:t>
+        <w:t xml:space="preserve"> [7/11/2026]</w:t>
       </w:r>
     </w:p>
     <w:p>
@@ -1545,7 +1726,6 @@
           <m:r>
             <w:rPr>
               <w:rFonts w:ascii="Roboto Mono" w:hAnsi="Roboto Mono"/>
-              <w:i/>
             </w:rPr>
             <w:br/>
           </m:r>
@@ -1596,7 +1776,6 @@
           <m:r>
             <w:rPr>
               <w:rFonts w:ascii="Roboto Mono" w:hAnsi="Roboto Mono"/>
-              <w:i/>
             </w:rPr>
             <w:br/>
           </m:r>
@@ -1627,7 +1806,7 @@
           <w:rFonts w:ascii="Roboto Mono" w:hAnsi="Roboto Mono"/>
         </w:rPr>
         <w:pict w14:anchorId="25FE37E9">
-          <v:rect id="_x0000_i1237" style="width:0;height:1.5pt" o:hralign="center" o:hrstd="t" o:hr="t" fillcolor="#a0a0a0" stroked="f"/>
+          <v:rect id="_x0000_i1033" style="width:0;height:1.5pt" o:hralign="center" o:hrstd="t" o:hr="t" fillcolor="#a0a0a0" stroked="f"/>
         </w:pict>
       </w:r>
     </w:p>
@@ -1657,7 +1836,27 @@
           <w:sz w:val="18"/>
           <w:highlight w:val="lightGray"/>
         </w:rPr>
-        <w:t xml:space="preserve">: Persons Table -&gt; ID Column: 1, Name_En Column: Motasem Essam] -&gt; </w:t>
+        <w:t xml:space="preserve">: Persons Table -&gt; ID Column: 1, </w:t>
+      </w:r>
+      <w:proofErr w:type="spellStart"/>
+      <w:r>
+        <w:rPr>
+          <w:rFonts w:ascii="Arial" w:eastAsia="Arial" w:hAnsi="Arial" w:cs="Arial"/>
+          <w:color w:val="000000"/>
+          <w:sz w:val="18"/>
+          <w:highlight w:val="lightGray"/>
+        </w:rPr>
+        <w:t>Name_En</w:t>
+      </w:r>
+      <w:proofErr w:type="spellEnd"/>
+      <w:r>
+        <w:rPr>
+          <w:rFonts w:ascii="Arial" w:eastAsia="Arial" w:hAnsi="Arial" w:cs="Arial"/>
+          <w:color w:val="000000"/>
+          <w:sz w:val="18"/>
+          <w:highlight w:val="lightGray"/>
+        </w:rPr>
+        <w:t xml:space="preserve"> Column: Motasem Essam] -&gt; </w:t>
       </w:r>
       <w:r>
         <w:rPr>
@@ -1695,7 +1894,7 @@
           <w:sz w:val="18"/>
           <w:highlight w:val="lightGray"/>
         </w:rPr>
-        <w:t xml:space="preserve"> [7/15/2026]</w:t>
+        <w:t xml:space="preserve"> [7/11/2026]</w:t>
       </w:r>
     </w:p>
     <w:p>
@@ -1741,7 +1940,6 @@
           <m:r>
             <w:rPr>
               <w:rFonts w:ascii="Roboto Mono" w:hAnsi="Roboto Mono"/>
-              <w:i/>
             </w:rPr>
             <w:br/>
           </m:r>
@@ -1778,7 +1976,6 @@
           <m:r>
             <w:rPr>
               <w:rFonts w:ascii="Roboto Mono" w:hAnsi="Roboto Mono"/>
-              <w:i/>
             </w:rPr>
             <w:br/>
           </m:r>
@@ -1824,6 +2021,9 @@
             </m:e>
           </m:borderBox>
           <m:r>
+            <m:rPr>
+              <m:sty m:val="p"/>
+            </m:rPr>
             <w:rPr>
               <w:rFonts w:ascii="Roboto Mono" w:hAnsi="Roboto Mono"/>
             </w:rPr>
@@ -1862,7 +2062,6 @@
           <m:r>
             <w:rPr>
               <w:rFonts w:ascii="Roboto Mono" w:hAnsi="Roboto Mono"/>
-              <w:i/>
             </w:rPr>
             <w:br/>
           </m:r>
@@ -1899,7 +2098,6 @@
           <m:r>
             <w:rPr>
               <w:rFonts w:ascii="Roboto Mono" w:hAnsi="Roboto Mono"/>
-              <w:i/>
             </w:rPr>
             <w:br/>
           </m:r>
@@ -1945,6 +2143,9 @@
             </m:e>
           </m:borderBox>
           <m:r>
+            <m:rPr>
+              <m:sty m:val="p"/>
+            </m:rPr>
             <w:rPr>
               <w:rFonts w:ascii="Roboto Mono" w:hAnsi="Roboto Mono"/>
             </w:rPr>
@@ -1965,7 +2166,7 @@
         </w:rPr>
         <w:lastRenderedPageBreak/>
         <w:pict w14:anchorId="24B3A1F7">
-          <v:rect id="_x0000_i1238" style="width:0;height:1.5pt" o:hralign="center" o:hrstd="t" o:hr="t" fillcolor="#a0a0a0" stroked="f"/>
+          <v:rect id="_x0000_i1034" style="width:0;height:1.5pt" o:hralign="center" o:hrstd="t" o:hr="t" fillcolor="#a0a0a0" stroked="f"/>
         </w:pict>
       </w:r>
     </w:p>
@@ -1995,7 +2196,27 @@
           <w:sz w:val="18"/>
           <w:highlight w:val="lightGray"/>
         </w:rPr>
-        <w:t xml:space="preserve">: Persons Table -&gt; ID Column: 1, Name_En Column: Motasem Essam] -&gt; </w:t>
+        <w:t xml:space="preserve">: Persons Table -&gt; ID Column: 1, </w:t>
+      </w:r>
+      <w:proofErr w:type="spellStart"/>
+      <w:r>
+        <w:rPr>
+          <w:rFonts w:ascii="Arial" w:eastAsia="Arial" w:hAnsi="Arial" w:cs="Arial"/>
+          <w:color w:val="000000"/>
+          <w:sz w:val="18"/>
+          <w:highlight w:val="lightGray"/>
+        </w:rPr>
+        <w:t>Name_En</w:t>
+      </w:r>
+      <w:proofErr w:type="spellEnd"/>
+      <w:r>
+        <w:rPr>
+          <w:rFonts w:ascii="Arial" w:eastAsia="Arial" w:hAnsi="Arial" w:cs="Arial"/>
+          <w:color w:val="000000"/>
+          <w:sz w:val="18"/>
+          <w:highlight w:val="lightGray"/>
+        </w:rPr>
+        <w:t xml:space="preserve"> Column: Motasem Essam] -&gt; </w:t>
       </w:r>
       <w:r>
         <w:rPr>
@@ -2033,7 +2254,7 @@
           <w:sz w:val="18"/>
           <w:highlight w:val="lightGray"/>
         </w:rPr>
-        <w:t xml:space="preserve"> [7/15/2026]</w:t>
+        <w:t xml:space="preserve"> [7/11/2026]</w:t>
       </w:r>
     </w:p>
     <w:p>
@@ -2079,7 +2300,6 @@
           <m:r>
             <w:rPr>
               <w:rFonts w:ascii="Roboto Mono" w:hAnsi="Roboto Mono"/>
-              <w:i/>
             </w:rPr>
             <w:br/>
           </m:r>
@@ -2116,7 +2336,6 @@
           <m:r>
             <w:rPr>
               <w:rFonts w:ascii="Roboto Mono" w:hAnsi="Roboto Mono"/>
-              <w:i/>
             </w:rPr>
             <w:br/>
           </m:r>
@@ -2180,156 +2399,142 @@
             </m:e>
           </m:borderBox>
           <m:r>
-            <w:rPr>
-              <w:rFonts w:ascii="Roboto Mono" w:hAnsi="Roboto Mono"/>
-            </w:rPr>
-            <w:br/>
-          </m:r>
-        </m:oMath>
-      </m:oMathPara>
-    </w:p>
-    <w:p>
-      <w:pPr>
-        <w:rPr>
-          <w:rFonts w:ascii="Roboto Mono" w:hAnsi="Roboto Mono"/>
-        </w:rPr>
-      </w:pPr>
-      <w:r>
-        <w:rPr>
-          <w:rFonts w:ascii="Roboto Mono" w:hAnsi="Roboto Mono"/>
-        </w:rPr>
-        <w:pict w14:anchorId="1A593CAD">
-          <v:rect id="_x0000_i1239" style="width:0;height:1.5pt" o:hralign="center" o:hrstd="t" o:hr="t" fillcolor="#a0a0a0" stroked="f"/>
-        </w:pict>
-      </w:r>
-    </w:p>
-    <w:p>
-      <w:pPr>
-        <w:rPr>
-          <w:rFonts w:ascii="Roboto Mono" w:hAnsi="Roboto Mono"/>
-          <w:b/>
-          <w:bCs/>
-        </w:rPr>
-      </w:pPr>
-      <w:r>
-        <w:rPr>
-          <w:rFonts w:ascii="Roboto Mono" w:hAnsi="Roboto Mono"/>
-          <w:b/>
-          <w:bCs/>
-        </w:rPr>
-        <w:t>Example</w:t>
-      </w:r>
-    </w:p>
-    <w:p>
-      <w:pPr>
-        <w:rPr>
-          <w:rFonts w:ascii="Roboto Mono" w:hAnsi="Roboto Mono"/>
-        </w:rPr>
-      </w:pPr>
-      <w:r>
-        <w:rPr>
-          <w:rFonts w:ascii="Roboto Mono" w:hAnsi="Roboto Mono"/>
-        </w:rPr>
-        <w:t>Distance between</w:t>
-      </w:r>
-    </w:p>
-    <w:p>
-      <w:pPr>
-        <w:rPr>
-          <w:rFonts w:ascii="Roboto Mono" w:hAnsi="Roboto Mono"/>
-        </w:rPr>
-      </w:pPr>
-      <m:oMathPara>
-        <m:oMath>
-          <m:r>
-            <w:rPr>
-              <w:rFonts w:ascii="Cambria Math" w:hAnsi="Cambria Math"/>
-            </w:rPr>
-            <m:t>2</m:t>
-          </m:r>
-          <m:r>
-            <w:rPr>
-              <w:rFonts w:ascii="Roboto Mono" w:hAnsi="Roboto Mono"/>
-              <w:i/>
-            </w:rPr>
-            <w:br/>
-          </m:r>
-        </m:oMath>
-      </m:oMathPara>
-    </w:p>
-    <w:p>
-      <w:pPr>
-        <w:rPr>
-          <w:rFonts w:ascii="Roboto Mono" w:hAnsi="Roboto Mono"/>
-        </w:rPr>
-      </w:pPr>
-      <w:r>
-        <w:rPr>
-          <w:rFonts w:ascii="Roboto Mono" w:hAnsi="Roboto Mono"/>
-        </w:rPr>
-        <w:t>and</w:t>
-      </w:r>
-    </w:p>
-    <w:p>
-      <w:pPr>
-        <w:rPr>
-          <w:rFonts w:ascii="Roboto Mono" w:hAnsi="Roboto Mono"/>
-        </w:rPr>
-      </w:pPr>
-      <m:oMathPara>
-        <m:oMath>
-          <m:r>
-            <w:rPr>
-              <w:rFonts w:ascii="Cambria Math" w:hAnsi="Cambria Math"/>
-            </w:rPr>
-            <m:t>-5</m:t>
-          </m:r>
-          <m:r>
-            <w:rPr>
-              <w:rFonts w:ascii="Roboto Mono" w:hAnsi="Roboto Mono"/>
-              <w:i/>
-            </w:rPr>
-            <w:br/>
-          </m:r>
-        </m:oMath>
-      </m:oMathPara>
-    </w:p>
-    <w:p>
-      <w:pPr>
-        <w:rPr>
-          <w:rFonts w:ascii="Roboto Mono" w:hAnsi="Roboto Mono"/>
-        </w:rPr>
-      </w:pPr>
-      <w:r>
-        <w:rPr>
-          <w:rFonts w:ascii="Roboto Mono" w:hAnsi="Roboto Mono"/>
-        </w:rPr>
-        <w:t>is</w:t>
-      </w:r>
-    </w:p>
-    <w:p>
-      <w:pPr>
-        <w:rPr>
-          <w:rFonts w:ascii="Roboto Mono" w:hAnsi="Roboto Mono"/>
-        </w:rPr>
-      </w:pPr>
-      <m:oMathPara>
-        <m:oMath>
-          <m:r>
             <m:rPr>
               <m:sty m:val="p"/>
             </m:rPr>
             <w:rPr>
+              <w:rFonts w:ascii="Roboto Mono" w:hAnsi="Roboto Mono"/>
+            </w:rPr>
+            <w:br/>
+          </m:r>
+        </m:oMath>
+      </m:oMathPara>
+    </w:p>
+    <w:p>
+      <w:pPr>
+        <w:rPr>
+          <w:rFonts w:ascii="Roboto Mono" w:hAnsi="Roboto Mono"/>
+        </w:rPr>
+      </w:pPr>
+      <w:r>
+        <w:rPr>
+          <w:rFonts w:ascii="Roboto Mono" w:hAnsi="Roboto Mono"/>
+        </w:rPr>
+        <w:pict w14:anchorId="1A593CAD">
+          <v:rect id="_x0000_i1035" style="width:0;height:1.5pt" o:hralign="center" o:hrstd="t" o:hr="t" fillcolor="#a0a0a0" stroked="f"/>
+        </w:pict>
+      </w:r>
+    </w:p>
+    <w:p>
+      <w:pPr>
+        <w:rPr>
+          <w:rFonts w:ascii="Roboto Mono" w:hAnsi="Roboto Mono"/>
+          <w:b/>
+          <w:bCs/>
+        </w:rPr>
+      </w:pPr>
+      <w:r>
+        <w:rPr>
+          <w:rFonts w:ascii="Roboto Mono" w:hAnsi="Roboto Mono"/>
+          <w:b/>
+          <w:bCs/>
+        </w:rPr>
+        <w:t>Example</w:t>
+      </w:r>
+    </w:p>
+    <w:p>
+      <w:pPr>
+        <w:rPr>
+          <w:rFonts w:ascii="Roboto Mono" w:hAnsi="Roboto Mono"/>
+        </w:rPr>
+      </w:pPr>
+      <w:r>
+        <w:rPr>
+          <w:rFonts w:ascii="Roboto Mono" w:hAnsi="Roboto Mono"/>
+        </w:rPr>
+        <w:t>Distance between</w:t>
+      </w:r>
+    </w:p>
+    <w:p>
+      <w:pPr>
+        <w:rPr>
+          <w:rFonts w:ascii="Roboto Mono" w:hAnsi="Roboto Mono"/>
+        </w:rPr>
+      </w:pPr>
+      <m:oMathPara>
+        <m:oMath>
+          <m:r>
+            <w:rPr>
               <w:rFonts w:ascii="Cambria Math" w:hAnsi="Cambria Math"/>
             </w:rPr>
-            <m:t>∣</m:t>
-          </m:r>
+            <m:t>2</m:t>
+          </m:r>
+          <m:r>
+            <w:rPr>
+              <w:rFonts w:ascii="Roboto Mono" w:hAnsi="Roboto Mono"/>
+            </w:rPr>
+            <w:br/>
+          </m:r>
+        </m:oMath>
+      </m:oMathPara>
+    </w:p>
+    <w:p>
+      <w:pPr>
+        <w:rPr>
+          <w:rFonts w:ascii="Roboto Mono" w:hAnsi="Roboto Mono"/>
+        </w:rPr>
+      </w:pPr>
+      <w:r>
+        <w:rPr>
+          <w:rFonts w:ascii="Roboto Mono" w:hAnsi="Roboto Mono"/>
+        </w:rPr>
+        <w:t>and</w:t>
+      </w:r>
+    </w:p>
+    <w:p>
+      <w:pPr>
+        <w:rPr>
+          <w:rFonts w:ascii="Roboto Mono" w:hAnsi="Roboto Mono"/>
+        </w:rPr>
+      </w:pPr>
+      <m:oMathPara>
+        <m:oMath>
           <m:r>
             <w:rPr>
               <w:rFonts w:ascii="Cambria Math" w:hAnsi="Cambria Math"/>
             </w:rPr>
-            <m:t>2-(-5)</m:t>
-          </m:r>
+            <m:t>-5</m:t>
+          </m:r>
+          <m:r>
+            <w:rPr>
+              <w:rFonts w:ascii="Roboto Mono" w:hAnsi="Roboto Mono"/>
+            </w:rPr>
+            <w:br/>
+          </m:r>
+        </m:oMath>
+      </m:oMathPara>
+    </w:p>
+    <w:p>
+      <w:pPr>
+        <w:rPr>
+          <w:rFonts w:ascii="Roboto Mono" w:hAnsi="Roboto Mono"/>
+        </w:rPr>
+      </w:pPr>
+      <w:r>
+        <w:rPr>
+          <w:rFonts w:ascii="Roboto Mono" w:hAnsi="Roboto Mono"/>
+        </w:rPr>
+        <w:t>is</w:t>
+      </w:r>
+    </w:p>
+    <w:p>
+      <w:pPr>
+        <w:rPr>
+          <w:rFonts w:ascii="Roboto Mono" w:hAnsi="Roboto Mono"/>
+        </w:rPr>
+      </w:pPr>
+      <m:oMathPara>
+        <m:oMath>
           <m:r>
             <m:rPr>
               <m:sty m:val="p"/>
@@ -2343,12 +2548,26 @@
             <w:rPr>
               <w:rFonts w:ascii="Cambria Math" w:hAnsi="Cambria Math"/>
             </w:rPr>
+            <m:t>2-(-5)</m:t>
+          </m:r>
+          <m:r>
+            <m:rPr>
+              <m:sty m:val="p"/>
+            </m:rPr>
+            <w:rPr>
+              <w:rFonts w:ascii="Cambria Math" w:hAnsi="Cambria Math"/>
+            </w:rPr>
+            <m:t>∣</m:t>
+          </m:r>
+          <m:r>
+            <w:rPr>
+              <w:rFonts w:ascii="Cambria Math" w:hAnsi="Cambria Math"/>
+            </w:rPr>
             <m:t>=7</m:t>
           </m:r>
           <m:r>
             <w:rPr>
               <w:rFonts w:ascii="Roboto Mono" w:hAnsi="Roboto Mono"/>
-              <w:i/>
             </w:rPr>
             <w:br/>
           </m:r>
@@ -2366,7 +2585,7 @@
           <w:rFonts w:ascii="Roboto Mono" w:hAnsi="Roboto Mono"/>
         </w:rPr>
         <w:pict w14:anchorId="6C79784F">
-          <v:rect id="_x0000_i1240" style="width:0;height:1.5pt" o:hralign="center" o:hrstd="t" o:hr="t" fillcolor="#a0a0a0" stroked="f"/>
+          <v:rect id="_x0000_i1036" style="width:0;height:1.5pt" o:hralign="center" o:hrstd="t" o:hr="t" fillcolor="#a0a0a0" stroked="f"/>
         </w:pict>
       </w:r>
     </w:p>
@@ -2397,7 +2616,27 @@
           <w:sz w:val="18"/>
           <w:highlight w:val="lightGray"/>
         </w:rPr>
-        <w:t xml:space="preserve">: Persons Table -&gt; ID Column: 1, Name_En Column: Motasem Essam] -&gt; </w:t>
+        <w:t xml:space="preserve">: Persons Table -&gt; ID Column: 1, </w:t>
+      </w:r>
+      <w:proofErr w:type="spellStart"/>
+      <w:r>
+        <w:rPr>
+          <w:rFonts w:ascii="Arial" w:eastAsia="Arial" w:hAnsi="Arial" w:cs="Arial"/>
+          <w:color w:val="000000"/>
+          <w:sz w:val="18"/>
+          <w:highlight w:val="lightGray"/>
+        </w:rPr>
+        <w:t>Name_En</w:t>
+      </w:r>
+      <w:proofErr w:type="spellEnd"/>
+      <w:r>
+        <w:rPr>
+          <w:rFonts w:ascii="Arial" w:eastAsia="Arial" w:hAnsi="Arial" w:cs="Arial"/>
+          <w:color w:val="000000"/>
+          <w:sz w:val="18"/>
+          <w:highlight w:val="lightGray"/>
+        </w:rPr>
+        <w:t xml:space="preserve"> Column: Motasem Essam] -&gt; </w:t>
       </w:r>
       <w:r>
         <w:rPr>
@@ -2435,7 +2674,7 @@
           <w:sz w:val="18"/>
           <w:highlight w:val="lightGray"/>
         </w:rPr>
-        <w:t xml:space="preserve"> [7/15/2026]</w:t>
+        <w:t xml:space="preserve"> [7/11/2026]</w:t>
       </w:r>
     </w:p>
     <w:p>
@@ -2496,6 +2735,9 @@
             </m:e>
           </m:borderBox>
           <m:r>
+            <m:rPr>
+              <m:sty m:val="p"/>
+            </m:rPr>
             <w:rPr>
               <w:rFonts w:ascii="Roboto Mono" w:hAnsi="Roboto Mono"/>
             </w:rPr>
@@ -2515,7 +2757,7 @@
           <w:rFonts w:ascii="Roboto Mono" w:hAnsi="Roboto Mono"/>
         </w:rPr>
         <w:pict w14:anchorId="0B096923">
-          <v:rect id="_x0000_i1241" style="width:0;height:1.5pt" o:hralign="center" o:hrstd="t" o:hr="t" fillcolor="#a0a0a0" stroked="f"/>
+          <v:rect id="_x0000_i1037" style="width:0;height:1.5pt" o:hralign="center" o:hrstd="t" o:hr="t" fillcolor="#a0a0a0" stroked="f"/>
         </w:pict>
       </w:r>
     </w:p>
@@ -2566,7 +2808,6 @@
           <m:r>
             <w:rPr>
               <w:rFonts w:ascii="Roboto Mono" w:hAnsi="Roboto Mono"/>
-              <w:i/>
             </w:rPr>
             <w:br/>
           </m:r>
@@ -2603,7 +2844,6 @@
           <m:r>
             <w:rPr>
               <w:rFonts w:ascii="Roboto Mono" w:hAnsi="Roboto Mono"/>
-              <w:i/>
             </w:rPr>
             <w:br/>
           </m:r>
@@ -2665,7 +2905,6 @@
           <m:r>
             <w:rPr>
               <w:rFonts w:ascii="Roboto Mono" w:hAnsi="Roboto Mono"/>
-              <w:i/>
             </w:rPr>
             <w:br/>
           </m:r>
@@ -2683,7 +2922,7 @@
           <w:rFonts w:ascii="Roboto Mono" w:hAnsi="Roboto Mono"/>
         </w:rPr>
         <w:pict w14:anchorId="03130FB4">
-          <v:rect id="_x0000_i1242" style="width:0;height:1.5pt" o:hralign="center" o:hrstd="t" o:hr="t" fillcolor="#a0a0a0" stroked="f"/>
+          <v:rect id="_x0000_i1038" style="width:0;height:1.5pt" o:hralign="center" o:hrstd="t" o:hr="t" fillcolor="#a0a0a0" stroked="f"/>
         </w:pict>
       </w:r>
     </w:p>
@@ -2713,7 +2952,27 @@
           <w:sz w:val="18"/>
           <w:highlight w:val="lightGray"/>
         </w:rPr>
-        <w:t xml:space="preserve">: Persons Table -&gt; ID Column: 1, Name_En Column: Motasem Essam] -&gt; </w:t>
+        <w:t xml:space="preserve">: Persons Table -&gt; ID Column: 1, </w:t>
+      </w:r>
+      <w:proofErr w:type="spellStart"/>
+      <w:r>
+        <w:rPr>
+          <w:rFonts w:ascii="Arial" w:eastAsia="Arial" w:hAnsi="Arial" w:cs="Arial"/>
+          <w:color w:val="000000"/>
+          <w:sz w:val="18"/>
+          <w:highlight w:val="lightGray"/>
+        </w:rPr>
+        <w:t>Name_En</w:t>
+      </w:r>
+      <w:proofErr w:type="spellEnd"/>
+      <w:r>
+        <w:rPr>
+          <w:rFonts w:ascii="Arial" w:eastAsia="Arial" w:hAnsi="Arial" w:cs="Arial"/>
+          <w:color w:val="000000"/>
+          <w:sz w:val="18"/>
+          <w:highlight w:val="lightGray"/>
+        </w:rPr>
+        <w:t xml:space="preserve"> Column: Motasem Essam] -&gt; </w:t>
       </w:r>
       <w:r>
         <w:rPr>
@@ -2751,7 +3010,7 @@
           <w:sz w:val="18"/>
           <w:highlight w:val="lightGray"/>
         </w:rPr>
-        <w:t xml:space="preserve"> [7/15/2026]</w:t>
+        <w:t xml:space="preserve"> [7/11/2026]</w:t>
       </w:r>
     </w:p>
     <w:p>
@@ -2811,51 +3070,38 @@
             </m:e>
           </m:borderBox>
           <m:r>
-            <w:rPr>
-              <w:rFonts w:ascii="Roboto Mono" w:hAnsi="Roboto Mono"/>
-            </w:rPr>
-            <w:br/>
-          </m:r>
-        </m:oMath>
-      </m:oMathPara>
-    </w:p>
-    <w:p>
-      <w:pPr>
-        <w:rPr>
-          <w:rFonts w:ascii="Roboto Mono" w:hAnsi="Roboto Mono"/>
-        </w:rPr>
-      </w:pPr>
-      <w:r>
-        <w:rPr>
-          <w:rFonts w:ascii="Roboto Mono" w:hAnsi="Roboto Mono"/>
-        </w:rPr>
-        <w:t>Examples:</w:t>
-      </w:r>
-    </w:p>
-    <w:p>
-      <w:pPr>
-        <w:rPr>
-          <w:rFonts w:ascii="Roboto Mono" w:hAnsi="Roboto Mono"/>
-        </w:rPr>
-      </w:pPr>
-      <m:oMathPara>
-        <m:oMath>
-          <m:r>
             <m:rPr>
               <m:sty m:val="p"/>
             </m:rPr>
             <w:rPr>
-              <w:rFonts w:ascii="Cambria Math" w:hAnsi="Cambria Math"/>
-            </w:rPr>
-            <w:lastRenderedPageBreak/>
-            <m:t>∣</m:t>
-          </m:r>
-          <m:r>
-            <w:rPr>
-              <w:rFonts w:ascii="Cambria Math" w:hAnsi="Cambria Math"/>
-            </w:rPr>
-            <m:t>5</m:t>
-          </m:r>
+              <w:rFonts w:ascii="Roboto Mono" w:hAnsi="Roboto Mono"/>
+            </w:rPr>
+            <w:br/>
+          </m:r>
+        </m:oMath>
+      </m:oMathPara>
+    </w:p>
+    <w:p>
+      <w:pPr>
+        <w:rPr>
+          <w:rFonts w:ascii="Roboto Mono" w:hAnsi="Roboto Mono"/>
+        </w:rPr>
+      </w:pPr>
+      <w:r>
+        <w:rPr>
+          <w:rFonts w:ascii="Roboto Mono" w:hAnsi="Roboto Mono"/>
+        </w:rPr>
+        <w:t>Examples:</w:t>
+      </w:r>
+    </w:p>
+    <w:p>
+      <w:pPr>
+        <w:rPr>
+          <w:rFonts w:ascii="Roboto Mono" w:hAnsi="Roboto Mono"/>
+        </w:rPr>
+      </w:pPr>
+      <m:oMathPara>
+        <m:oMath>
           <m:r>
             <m:rPr>
               <m:sty m:val="p"/>
@@ -2863,23 +3109,15 @@
             <w:rPr>
               <w:rFonts w:ascii="Cambria Math" w:hAnsi="Cambria Math"/>
             </w:rPr>
+            <w:lastRenderedPageBreak/>
             <m:t>∣</m:t>
           </m:r>
           <m:r>
             <w:rPr>
               <w:rFonts w:ascii="Cambria Math" w:hAnsi="Cambria Math"/>
             </w:rPr>
-            <m:t>=5</m:t>
-          </m:r>
-          <m:r>
-            <w:rPr>
-              <w:rFonts w:ascii="Roboto Mono" w:hAnsi="Roboto Mono"/>
-              <w:i/>
-            </w:rPr>
-            <w:br/>
-          </m:r>
-        </m:oMath>
-        <m:oMath>
+            <m:t>5</m:t>
+          </m:r>
           <m:r>
             <m:rPr>
               <m:sty m:val="p"/>
@@ -2893,8 +3131,16 @@
             <w:rPr>
               <w:rFonts w:ascii="Cambria Math" w:hAnsi="Cambria Math"/>
             </w:rPr>
-            <m:t>-5</m:t>
-          </m:r>
+            <m:t>=5</m:t>
+          </m:r>
+          <m:r>
+            <w:rPr>
+              <w:rFonts w:ascii="Roboto Mono" w:hAnsi="Roboto Mono"/>
+            </w:rPr>
+            <w:br/>
+          </m:r>
+        </m:oMath>
+        <m:oMath>
           <m:r>
             <m:rPr>
               <m:sty m:val="p"/>
@@ -2908,12 +3154,26 @@
             <w:rPr>
               <w:rFonts w:ascii="Cambria Math" w:hAnsi="Cambria Math"/>
             </w:rPr>
+            <m:t>-5</m:t>
+          </m:r>
+          <m:r>
+            <m:rPr>
+              <m:sty m:val="p"/>
+            </m:rPr>
+            <w:rPr>
+              <w:rFonts w:ascii="Cambria Math" w:hAnsi="Cambria Math"/>
+            </w:rPr>
+            <m:t>∣</m:t>
+          </m:r>
+          <m:r>
+            <w:rPr>
+              <w:rFonts w:ascii="Cambria Math" w:hAnsi="Cambria Math"/>
+            </w:rPr>
             <m:t>=5</m:t>
           </m:r>
           <m:r>
             <w:rPr>
               <w:rFonts w:ascii="Roboto Mono" w:hAnsi="Roboto Mono"/>
-              <w:i/>
             </w:rPr>
             <w:br/>
           </m:r>
@@ -2931,7 +3191,7 @@
           <w:rFonts w:ascii="Roboto Mono" w:hAnsi="Roboto Mono"/>
         </w:rPr>
         <w:pict w14:anchorId="0D4E1169">
-          <v:rect id="_x0000_i1243" style="width:0;height:1.5pt" o:hralign="center" o:hrstd="t" o:hr="t" fillcolor="#a0a0a0" stroked="f"/>
+          <v:rect id="_x0000_i1039" style="width:0;height:1.5pt" o:hralign="center" o:hrstd="t" o:hr="t" fillcolor="#a0a0a0" stroked="f"/>
         </w:pict>
       </w:r>
     </w:p>
@@ -2961,7 +3221,27 @@
           <w:sz w:val="18"/>
           <w:highlight w:val="lightGray"/>
         </w:rPr>
-        <w:t xml:space="preserve">: Persons Table -&gt; ID Column: 1, Name_En Column: Motasem Essam] -&gt; </w:t>
+        <w:t xml:space="preserve">: Persons Table -&gt; ID Column: 1, </w:t>
+      </w:r>
+      <w:proofErr w:type="spellStart"/>
+      <w:r>
+        <w:rPr>
+          <w:rFonts w:ascii="Arial" w:eastAsia="Arial" w:hAnsi="Arial" w:cs="Arial"/>
+          <w:color w:val="000000"/>
+          <w:sz w:val="18"/>
+          <w:highlight w:val="lightGray"/>
+        </w:rPr>
+        <w:t>Name_En</w:t>
+      </w:r>
+      <w:proofErr w:type="spellEnd"/>
+      <w:r>
+        <w:rPr>
+          <w:rFonts w:ascii="Arial" w:eastAsia="Arial" w:hAnsi="Arial" w:cs="Arial"/>
+          <w:color w:val="000000"/>
+          <w:sz w:val="18"/>
+          <w:highlight w:val="lightGray"/>
+        </w:rPr>
+        <w:t xml:space="preserve"> Column: Motasem Essam] -&gt; </w:t>
       </w:r>
       <w:r>
         <w:rPr>
@@ -2999,7 +3279,7 @@
           <w:sz w:val="18"/>
           <w:highlight w:val="lightGray"/>
         </w:rPr>
-        <w:t xml:space="preserve"> [7/15/2026]</w:t>
+        <w:t xml:space="preserve"> [7/11/2026]</w:t>
       </w:r>
     </w:p>
     <w:p>
@@ -3165,7 +3445,7 @@
           <w:rFonts w:ascii="Roboto Mono" w:hAnsi="Roboto Mono"/>
         </w:rPr>
         <w:pict w14:anchorId="06FE9249">
-          <v:rect id="_x0000_i1244" style="width:0;height:1.5pt" o:hralign="center" o:hrstd="t" o:hr="t" fillcolor="#a0a0a0" stroked="f"/>
+          <v:rect id="_x0000_i1040" style="width:0;height:1.5pt" o:hralign="center" o:hrstd="t" o:hr="t" fillcolor="#a0a0a0" stroked="f"/>
         </w:pict>
       </w:r>
     </w:p>
@@ -3195,7 +3475,27 @@
           <w:sz w:val="18"/>
           <w:highlight w:val="lightGray"/>
         </w:rPr>
-        <w:t xml:space="preserve">: Persons Table -&gt; ID Column: 1, Name_En Column: Motasem Essam] -&gt; </w:t>
+        <w:t xml:space="preserve">: Persons Table -&gt; ID Column: 1, </w:t>
+      </w:r>
+      <w:proofErr w:type="spellStart"/>
+      <w:r>
+        <w:rPr>
+          <w:rFonts w:ascii="Arial" w:eastAsia="Arial" w:hAnsi="Arial" w:cs="Arial"/>
+          <w:color w:val="000000"/>
+          <w:sz w:val="18"/>
+          <w:highlight w:val="lightGray"/>
+        </w:rPr>
+        <w:t>Name_En</w:t>
+      </w:r>
+      <w:proofErr w:type="spellEnd"/>
+      <w:r>
+        <w:rPr>
+          <w:rFonts w:ascii="Arial" w:eastAsia="Arial" w:hAnsi="Arial" w:cs="Arial"/>
+          <w:color w:val="000000"/>
+          <w:sz w:val="18"/>
+          <w:highlight w:val="lightGray"/>
+        </w:rPr>
+        <w:t xml:space="preserve"> Column: Motasem Essam] -&gt; </w:t>
       </w:r>
       <w:r>
         <w:rPr>
@@ -3233,7 +3533,7 @@
           <w:sz w:val="18"/>
           <w:highlight w:val="lightGray"/>
         </w:rPr>
-        <w:t xml:space="preserve"> [7/15/2026]</w:t>
+        <w:t xml:space="preserve"> [7/11/2026]</w:t>
       </w:r>
     </w:p>
     <w:p>
@@ -3300,7 +3600,6 @@
           <m:r>
             <w:rPr>
               <w:rFonts w:ascii="Roboto Mono" w:hAnsi="Roboto Mono"/>
-              <w:i/>
             </w:rPr>
             <w:br/>
           </m:r>
@@ -3318,7 +3617,7 @@
           <w:rFonts w:ascii="Roboto Mono" w:hAnsi="Roboto Mono"/>
         </w:rPr>
         <w:pict w14:anchorId="6F3EBA46">
-          <v:rect id="_x0000_i1245" style="width:0;height:1.5pt" o:hralign="center" o:hrstd="t" o:hr="t" fillcolor="#a0a0a0" stroked="f"/>
+          <v:rect id="_x0000_i1041" style="width:0;height:1.5pt" o:hralign="center" o:hrstd="t" o:hr="t" fillcolor="#a0a0a0" stroked="f"/>
         </w:pict>
       </w:r>
     </w:p>
@@ -3386,7 +3685,6 @@
           <m:r>
             <w:rPr>
               <w:rFonts w:ascii="Roboto Mono" w:hAnsi="Roboto Mono"/>
-              <w:i/>
             </w:rPr>
             <w:br/>
           </m:r>
@@ -3404,7 +3702,7 @@
           <w:rFonts w:ascii="Roboto Mono" w:hAnsi="Roboto Mono"/>
         </w:rPr>
         <w:pict w14:anchorId="547CF01D">
-          <v:rect id="_x0000_i1246" style="width:0;height:1.5pt" o:hralign="center" o:hrstd="t" o:hr="t" fillcolor="#a0a0a0" stroked="f"/>
+          <v:rect id="_x0000_i1042" style="width:0;height:1.5pt" o:hralign="center" o:hrstd="t" o:hr="t" fillcolor="#a0a0a0" stroked="f"/>
         </w:pict>
       </w:r>
     </w:p>
@@ -3443,7 +3741,6 @@
           <m:r>
             <w:rPr>
               <w:rFonts w:ascii="Roboto Mono" w:hAnsi="Roboto Mono"/>
-              <w:i/>
             </w:rPr>
             <w:br/>
           </m:r>
@@ -3461,7 +3758,7 @@
           <w:rFonts w:ascii="Roboto Mono" w:hAnsi="Roboto Mono"/>
         </w:rPr>
         <w:pict w14:anchorId="58147601">
-          <v:rect id="_x0000_i1247" style="width:0;height:1.5pt" o:hralign="center" o:hrstd="t" o:hr="t" fillcolor="#a0a0a0" stroked="f"/>
+          <v:rect id="_x0000_i1043" style="width:0;height:1.5pt" o:hralign="center" o:hrstd="t" o:hr="t" fillcolor="#a0a0a0" stroked="f"/>
         </w:pict>
       </w:r>
     </w:p>
@@ -3585,7 +3882,6 @@
           <m:r>
             <w:rPr>
               <w:rFonts w:ascii="Roboto Mono" w:hAnsi="Roboto Mono"/>
-              <w:i/>
             </w:rPr>
             <w:br/>
           </m:r>
@@ -3603,7 +3899,7 @@
           <w:rFonts w:ascii="Roboto Mono" w:hAnsi="Roboto Mono"/>
         </w:rPr>
         <w:pict w14:anchorId="23FFECAA">
-          <v:rect id="_x0000_i1248" style="width:0;height:1.5pt" o:hralign="center" o:hrstd="t" o:hr="t" fillcolor="#a0a0a0" stroked="f"/>
+          <v:rect id="_x0000_i1044" style="width:0;height:1.5pt" o:hralign="center" o:hrstd="t" o:hr="t" fillcolor="#a0a0a0" stroked="f"/>
         </w:pict>
       </w:r>
     </w:p>
@@ -3690,7 +3986,6 @@
           <m:r>
             <w:rPr>
               <w:rFonts w:ascii="Roboto Mono" w:hAnsi="Roboto Mono"/>
-              <w:i/>
             </w:rPr>
             <w:br/>
           </m:r>
@@ -3708,7 +4003,7 @@
           <w:rFonts w:ascii="Roboto Mono" w:hAnsi="Roboto Mono"/>
         </w:rPr>
         <w:pict w14:anchorId="2C27099B">
-          <v:rect id="_x0000_i1249" style="width:0;height:1.5pt" o:hralign="center" o:hrstd="t" o:hr="t" fillcolor="#a0a0a0" stroked="f"/>
+          <v:rect id="_x0000_i1045" style="width:0;height:1.5pt" o:hralign="center" o:hrstd="t" o:hr="t" fillcolor="#a0a0a0" stroked="f"/>
         </w:pict>
       </w:r>
     </w:p>
@@ -3738,7 +4033,27 @@
           <w:sz w:val="18"/>
           <w:highlight w:val="lightGray"/>
         </w:rPr>
-        <w:t xml:space="preserve">: Persons Table -&gt; ID Column: 1, Name_En Column: Motasem Essam] -&gt; </w:t>
+        <w:t xml:space="preserve">: Persons Table -&gt; ID Column: 1, </w:t>
+      </w:r>
+      <w:proofErr w:type="spellStart"/>
+      <w:r>
+        <w:rPr>
+          <w:rFonts w:ascii="Arial" w:eastAsia="Arial" w:hAnsi="Arial" w:cs="Arial"/>
+          <w:color w:val="000000"/>
+          <w:sz w:val="18"/>
+          <w:highlight w:val="lightGray"/>
+        </w:rPr>
+        <w:t>Name_En</w:t>
+      </w:r>
+      <w:proofErr w:type="spellEnd"/>
+      <w:r>
+        <w:rPr>
+          <w:rFonts w:ascii="Arial" w:eastAsia="Arial" w:hAnsi="Arial" w:cs="Arial"/>
+          <w:color w:val="000000"/>
+          <w:sz w:val="18"/>
+          <w:highlight w:val="lightGray"/>
+        </w:rPr>
+        <w:t xml:space="preserve"> Column: Motasem Essam] -&gt; </w:t>
       </w:r>
       <w:r>
         <w:rPr>
@@ -3776,7 +4091,7 @@
           <w:sz w:val="18"/>
           <w:highlight w:val="lightGray"/>
         </w:rPr>
-        <w:t xml:space="preserve"> [7/15/2026]</w:t>
+        <w:t xml:space="preserve"> [7/11/2026]</w:t>
       </w:r>
     </w:p>
     <w:p>
@@ -3850,7 +4165,7 @@
           <w:rFonts w:ascii="Roboto Mono" w:hAnsi="Roboto Mono"/>
         </w:rPr>
         <w:pict w14:anchorId="70A83C99">
-          <v:rect id="_x0000_i1250" style="width:0;height:1.5pt" o:hralign="center" o:hrstd="t" o:hr="t" fillcolor="#a0a0a0" stroked="f"/>
+          <v:rect id="_x0000_i1046" style="width:0;height:1.5pt" o:hralign="center" o:hrstd="t" o:hr="t" fillcolor="#a0a0a0" stroked="f"/>
         </w:pict>
       </w:r>
     </w:p>
@@ -3880,7 +4195,27 @@
           <w:sz w:val="18"/>
           <w:highlight w:val="lightGray"/>
         </w:rPr>
-        <w:t xml:space="preserve">: Persons Table -&gt; ID Column: 1, Name_En Column: Motasem Essam] -&gt; </w:t>
+        <w:t xml:space="preserve">: Persons Table -&gt; ID Column: 1, </w:t>
+      </w:r>
+      <w:proofErr w:type="spellStart"/>
+      <w:r>
+        <w:rPr>
+          <w:rFonts w:ascii="Arial" w:eastAsia="Arial" w:hAnsi="Arial" w:cs="Arial"/>
+          <w:color w:val="000000"/>
+          <w:sz w:val="18"/>
+          <w:highlight w:val="lightGray"/>
+        </w:rPr>
+        <w:t>Name_En</w:t>
+      </w:r>
+      <w:proofErr w:type="spellEnd"/>
+      <w:r>
+        <w:rPr>
+          <w:rFonts w:ascii="Arial" w:eastAsia="Arial" w:hAnsi="Arial" w:cs="Arial"/>
+          <w:color w:val="000000"/>
+          <w:sz w:val="18"/>
+          <w:highlight w:val="lightGray"/>
+        </w:rPr>
+        <w:t xml:space="preserve"> Column: Motasem Essam] -&gt; </w:t>
       </w:r>
       <w:r>
         <w:rPr>
@@ -3918,7 +4253,7 @@
           <w:sz w:val="18"/>
           <w:highlight w:val="lightGray"/>
         </w:rPr>
-        <w:t xml:space="preserve"> [7/15/2026]</w:t>
+        <w:t xml:space="preserve"> [7/11/2026]</w:t>
       </w:r>
     </w:p>
     <w:p>
@@ -3995,7 +4330,6 @@
           <m:r>
             <w:rPr>
               <w:rFonts w:ascii="Roboto Mono" w:hAnsi="Roboto Mono"/>
-              <w:i/>
             </w:rPr>
             <w:br/>
           </m:r>
@@ -4027,7 +4361,7 @@
           <w:rFonts w:ascii="Roboto Mono" w:hAnsi="Roboto Mono"/>
         </w:rPr>
         <w:pict w14:anchorId="0129A9C1">
-          <v:rect id="_x0000_i1251" style="width:0;height:1.5pt" o:hralign="center" o:hrstd="t" o:hr="t" fillcolor="#a0a0a0" stroked="f"/>
+          <v:rect id="_x0000_i1047" style="width:0;height:1.5pt" o:hralign="center" o:hrstd="t" o:hr="t" fillcolor="#a0a0a0" stroked="f"/>
         </w:pict>
       </w:r>
     </w:p>
@@ -4105,7 +4439,6 @@
           <m:r>
             <w:rPr>
               <w:rFonts w:ascii="Roboto Mono" w:hAnsi="Roboto Mono"/>
-              <w:i/>
             </w:rPr>
             <w:br/>
           </m:r>
@@ -4136,7 +4469,7 @@
           <w:rFonts w:ascii="Roboto Mono" w:hAnsi="Roboto Mono"/>
         </w:rPr>
         <w:pict w14:anchorId="36620171">
-          <v:rect id="_x0000_i1252" style="width:0;height:1.5pt" o:hralign="center" o:hrstd="t" o:hr="t" fillcolor="#a0a0a0" stroked="f"/>
+          <v:rect id="_x0000_i1048" style="width:0;height:1.5pt" o:hralign="center" o:hrstd="t" o:hr="t" fillcolor="#a0a0a0" stroked="f"/>
         </w:pict>
       </w:r>
     </w:p>
@@ -4214,7 +4547,6 @@
           <m:r>
             <w:rPr>
               <w:rFonts w:ascii="Roboto Mono" w:hAnsi="Roboto Mono"/>
-              <w:i/>
             </w:rPr>
             <w:br/>
           </m:r>
@@ -4232,7 +4564,7 @@
           <w:rFonts w:ascii="Roboto Mono" w:hAnsi="Roboto Mono"/>
         </w:rPr>
         <w:pict w14:anchorId="68DE2BF5">
-          <v:rect id="_x0000_i1253" style="width:0;height:1.5pt" o:hralign="center" o:hrstd="t" o:hr="t" fillcolor="#a0a0a0" stroked="f"/>
+          <v:rect id="_x0000_i1049" style="width:0;height:1.5pt" o:hralign="center" o:hrstd="t" o:hr="t" fillcolor="#a0a0a0" stroked="f"/>
         </w:pict>
       </w:r>
     </w:p>
@@ -4310,7 +4642,6 @@
           <m:r>
             <w:rPr>
               <w:rFonts w:ascii="Roboto Mono" w:hAnsi="Roboto Mono"/>
-              <w:i/>
             </w:rPr>
             <w:br/>
           </m:r>
@@ -4328,7 +4659,7 @@
           <w:rFonts w:ascii="Roboto Mono" w:hAnsi="Roboto Mono"/>
         </w:rPr>
         <w:pict w14:anchorId="2E494E7D">
-          <v:rect id="_x0000_i1254" style="width:0;height:1.5pt" o:hralign="center" o:hrstd="t" o:hr="t" fillcolor="#a0a0a0" stroked="f"/>
+          <v:rect id="_x0000_i1050" style="width:0;height:1.5pt" o:hralign="center" o:hrstd="t" o:hr="t" fillcolor="#a0a0a0" stroked="f"/>
         </w:pict>
       </w:r>
     </w:p>
@@ -4358,7 +4689,27 @@
           <w:sz w:val="18"/>
           <w:highlight w:val="lightGray"/>
         </w:rPr>
-        <w:t xml:space="preserve">: Persons Table -&gt; ID Column: 1, Name_En Column: Motasem Essam] -&gt; </w:t>
+        <w:t xml:space="preserve">: Persons Table -&gt; ID Column: 1, </w:t>
+      </w:r>
+      <w:proofErr w:type="spellStart"/>
+      <w:r>
+        <w:rPr>
+          <w:rFonts w:ascii="Arial" w:eastAsia="Arial" w:hAnsi="Arial" w:cs="Arial"/>
+          <w:color w:val="000000"/>
+          <w:sz w:val="18"/>
+          <w:highlight w:val="lightGray"/>
+        </w:rPr>
+        <w:t>Name_En</w:t>
+      </w:r>
+      <w:proofErr w:type="spellEnd"/>
+      <w:r>
+        <w:rPr>
+          <w:rFonts w:ascii="Arial" w:eastAsia="Arial" w:hAnsi="Arial" w:cs="Arial"/>
+          <w:color w:val="000000"/>
+          <w:sz w:val="18"/>
+          <w:highlight w:val="lightGray"/>
+        </w:rPr>
+        <w:t xml:space="preserve"> Column: Motasem Essam] -&gt; </w:t>
       </w:r>
       <w:r>
         <w:rPr>
@@ -4396,7 +4747,7 @@
           <w:sz w:val="18"/>
           <w:highlight w:val="lightGray"/>
         </w:rPr>
-        <w:t xml:space="preserve"> [7/15/2026]</w:t>
+        <w:t xml:space="preserve"> [7/11/2026]</w:t>
       </w:r>
     </w:p>
     <w:p>
@@ -4546,7 +4897,6 @@
           <m:r>
             <w:rPr>
               <w:rFonts w:ascii="Roboto Mono" w:hAnsi="Roboto Mono"/>
-              <w:i/>
             </w:rPr>
             <w:br/>
           </m:r>
@@ -4564,7 +4914,7 @@
           <w:rFonts w:ascii="Roboto Mono" w:hAnsi="Roboto Mono"/>
         </w:rPr>
         <w:pict w14:anchorId="4D54EE3F">
-          <v:rect id="_x0000_i1255" style="width:0;height:1.5pt" o:hralign="center" o:hrstd="t" o:hr="t" fillcolor="#a0a0a0" stroked="f"/>
+          <v:rect id="_x0000_i1051" style="width:0;height:1.5pt" o:hralign="center" o:hrstd="t" o:hr="t" fillcolor="#a0a0a0" stroked="f"/>
         </w:pict>
       </w:r>
     </w:p>
@@ -4701,7 +5051,6 @@
           <m:r>
             <w:rPr>
               <w:rFonts w:ascii="Roboto Mono" w:hAnsi="Roboto Mono"/>
-              <w:i/>
             </w:rPr>
             <w:br/>
           </m:r>
@@ -4719,7 +5068,7 @@
           <w:rFonts w:ascii="Roboto Mono" w:hAnsi="Roboto Mono"/>
         </w:rPr>
         <w:pict w14:anchorId="4E44C2C0">
-          <v:rect id="_x0000_i1256" style="width:0;height:1.5pt" o:hralign="center" o:hrstd="t" o:hr="t" fillcolor="#a0a0a0" stroked="f"/>
+          <v:rect id="_x0000_i1052" style="width:0;height:1.5pt" o:hralign="center" o:hrstd="t" o:hr="t" fillcolor="#a0a0a0" stroked="f"/>
         </w:pict>
       </w:r>
     </w:p>
@@ -4749,7 +5098,27 @@
           <w:sz w:val="18"/>
           <w:highlight w:val="lightGray"/>
         </w:rPr>
-        <w:t xml:space="preserve">: Persons Table -&gt; ID Column: 1, Name_En Column: Motasem Essam] -&gt; </w:t>
+        <w:t xml:space="preserve">: Persons Table -&gt; ID Column: 1, </w:t>
+      </w:r>
+      <w:proofErr w:type="spellStart"/>
+      <w:r>
+        <w:rPr>
+          <w:rFonts w:ascii="Arial" w:eastAsia="Arial" w:hAnsi="Arial" w:cs="Arial"/>
+          <w:color w:val="000000"/>
+          <w:sz w:val="18"/>
+          <w:highlight w:val="lightGray"/>
+        </w:rPr>
+        <w:t>Name_En</w:t>
+      </w:r>
+      <w:proofErr w:type="spellEnd"/>
+      <w:r>
+        <w:rPr>
+          <w:rFonts w:ascii="Arial" w:eastAsia="Arial" w:hAnsi="Arial" w:cs="Arial"/>
+          <w:color w:val="000000"/>
+          <w:sz w:val="18"/>
+          <w:highlight w:val="lightGray"/>
+        </w:rPr>
+        <w:t xml:space="preserve"> Column: Motasem Essam] -&gt; </w:t>
       </w:r>
       <w:r>
         <w:rPr>
@@ -4787,7 +5156,7 @@
           <w:sz w:val="18"/>
           <w:highlight w:val="lightGray"/>
         </w:rPr>
-        <w:t xml:space="preserve"> [7/15/2026]</w:t>
+        <w:t xml:space="preserve"> [7/11/2026]</w:t>
       </w:r>
     </w:p>
     <w:p>
@@ -4985,7 +5354,7 @@
           <w:rFonts w:ascii="Roboto Mono" w:hAnsi="Roboto Mono"/>
         </w:rPr>
         <w:pict w14:anchorId="3EF00DC0">
-          <v:rect id="_x0000_i1257" style="width:0;height:1.5pt" o:hralign="center" o:hrstd="t" o:hr="t" fillcolor="#a0a0a0" stroked="f"/>
+          <v:rect id="_x0000_i1053" style="width:0;height:1.5pt" o:hralign="center" o:hrstd="t" o:hr="t" fillcolor="#a0a0a0" stroked="f"/>
         </w:pict>
       </w:r>
     </w:p>
@@ -5015,7 +5384,27 @@
           <w:sz w:val="18"/>
           <w:highlight w:val="lightGray"/>
         </w:rPr>
-        <w:t xml:space="preserve">: Persons Table -&gt; ID Column: 1, Name_En Column: Motasem Essam] -&gt; </w:t>
+        <w:t xml:space="preserve">: Persons Table -&gt; ID Column: 1, </w:t>
+      </w:r>
+      <w:proofErr w:type="spellStart"/>
+      <w:r>
+        <w:rPr>
+          <w:rFonts w:ascii="Arial" w:eastAsia="Arial" w:hAnsi="Arial" w:cs="Arial"/>
+          <w:color w:val="000000"/>
+          <w:sz w:val="18"/>
+          <w:highlight w:val="lightGray"/>
+        </w:rPr>
+        <w:t>Name_En</w:t>
+      </w:r>
+      <w:proofErr w:type="spellEnd"/>
+      <w:r>
+        <w:rPr>
+          <w:rFonts w:ascii="Arial" w:eastAsia="Arial" w:hAnsi="Arial" w:cs="Arial"/>
+          <w:color w:val="000000"/>
+          <w:sz w:val="18"/>
+          <w:highlight w:val="lightGray"/>
+        </w:rPr>
+        <w:t xml:space="preserve"> Column: Motasem Essam] -&gt; </w:t>
       </w:r>
       <w:r>
         <w:rPr>
@@ -5053,7 +5442,7 @@
           <w:sz w:val="18"/>
           <w:highlight w:val="lightGray"/>
         </w:rPr>
-        <w:t xml:space="preserve"> [7/15/2026]</w:t>
+        <w:t xml:space="preserve"> [7/11/2026]</w:t>
       </w:r>
     </w:p>
     <w:p>
@@ -5250,7 +5639,7 @@
           <w:rFonts w:ascii="Roboto Mono" w:hAnsi="Roboto Mono"/>
         </w:rPr>
         <w:pict w14:anchorId="1A4C5BF7">
-          <v:rect id="_x0000_i1258" style="width:0;height:1.5pt" o:hralign="center" o:hrstd="t" o:hr="t" fillcolor="#a0a0a0" stroked="f"/>
+          <v:rect id="_x0000_i1054" style="width:0;height:1.5pt" o:hralign="center" o:hrstd="t" o:hr="t" fillcolor="#a0a0a0" stroked="f"/>
         </w:pict>
       </w:r>
     </w:p>
@@ -5280,7 +5669,27 @@
           <w:sz w:val="18"/>
           <w:highlight w:val="lightGray"/>
         </w:rPr>
-        <w:t xml:space="preserve">: Persons Table -&gt; ID Column: 1, Name_En Column: Motasem Essam] -&gt; </w:t>
+        <w:t xml:space="preserve">: Persons Table -&gt; ID Column: 1, </w:t>
+      </w:r>
+      <w:proofErr w:type="spellStart"/>
+      <w:r>
+        <w:rPr>
+          <w:rFonts w:ascii="Arial" w:eastAsia="Arial" w:hAnsi="Arial" w:cs="Arial"/>
+          <w:color w:val="000000"/>
+          <w:sz w:val="18"/>
+          <w:highlight w:val="lightGray"/>
+        </w:rPr>
+        <w:t>Name_En</w:t>
+      </w:r>
+      <w:proofErr w:type="spellEnd"/>
+      <w:r>
+        <w:rPr>
+          <w:rFonts w:ascii="Arial" w:eastAsia="Arial" w:hAnsi="Arial" w:cs="Arial"/>
+          <w:color w:val="000000"/>
+          <w:sz w:val="18"/>
+          <w:highlight w:val="lightGray"/>
+        </w:rPr>
+        <w:t xml:space="preserve"> Column: Motasem Essam] -&gt; </w:t>
       </w:r>
       <w:r>
         <w:rPr>
@@ -5318,7 +5727,7 @@
           <w:sz w:val="18"/>
           <w:highlight w:val="lightGray"/>
         </w:rPr>
-        <w:t xml:space="preserve"> [7/15/2026]</w:t>
+        <w:t xml:space="preserve"> [7/11/2026]</w:t>
       </w:r>
     </w:p>
     <w:p>
@@ -5418,7 +5827,7 @@
           <w:rFonts w:ascii="Roboto Mono" w:hAnsi="Roboto Mono"/>
         </w:rPr>
         <w:pict w14:anchorId="7E70C4B4">
-          <v:rect id="_x0000_i1259" style="width:0;height:1.5pt" o:hralign="center" o:hrstd="t" o:hr="t" fillcolor="#a0a0a0" stroked="f"/>
+          <v:rect id="_x0000_i1055" style="width:0;height:1.5pt" o:hralign="center" o:hrstd="t" o:hr="t" fillcolor="#a0a0a0" stroked="f"/>
         </w:pict>
       </w:r>
     </w:p>
@@ -5448,7 +5857,27 @@
           <w:sz w:val="18"/>
           <w:highlight w:val="lightGray"/>
         </w:rPr>
-        <w:t xml:space="preserve">: Persons Table -&gt; ID Column: 1, Name_En Column: Motasem Essam] -&gt; </w:t>
+        <w:t xml:space="preserve">: Persons Table -&gt; ID Column: 1, </w:t>
+      </w:r>
+      <w:proofErr w:type="spellStart"/>
+      <w:r>
+        <w:rPr>
+          <w:rFonts w:ascii="Arial" w:eastAsia="Arial" w:hAnsi="Arial" w:cs="Arial"/>
+          <w:color w:val="000000"/>
+          <w:sz w:val="18"/>
+          <w:highlight w:val="lightGray"/>
+        </w:rPr>
+        <w:t>Name_En</w:t>
+      </w:r>
+      <w:proofErr w:type="spellEnd"/>
+      <w:r>
+        <w:rPr>
+          <w:rFonts w:ascii="Arial" w:eastAsia="Arial" w:hAnsi="Arial" w:cs="Arial"/>
+          <w:color w:val="000000"/>
+          <w:sz w:val="18"/>
+          <w:highlight w:val="lightGray"/>
+        </w:rPr>
+        <w:t xml:space="preserve"> Column: Motasem Essam] -&gt; </w:t>
       </w:r>
       <w:r>
         <w:rPr>
@@ -5486,7 +5915,7 @@
           <w:sz w:val="18"/>
           <w:highlight w:val="lightGray"/>
         </w:rPr>
-        <w:t xml:space="preserve"> [7/15/2026]</w:t>
+        <w:t xml:space="preserve"> [7/11/2026]</w:t>
       </w:r>
     </w:p>
     <w:p>
@@ -5619,7 +6048,7 @@
           <w:rFonts w:ascii="Roboto Mono" w:hAnsi="Roboto Mono"/>
         </w:rPr>
         <w:pict w14:anchorId="47373383">
-          <v:rect id="_x0000_i1260" style="width:0;height:1.5pt" o:hralign="center" o:hrstd="t" o:hr="t" fillcolor="#a0a0a0" stroked="f"/>
+          <v:rect id="_x0000_i1056" style="width:0;height:1.5pt" o:hralign="center" o:hrstd="t" o:hr="t" fillcolor="#a0a0a0" stroked="f"/>
         </w:pict>
       </w:r>
     </w:p>
@@ -5656,7 +6085,27 @@
           <w:sz w:val="18"/>
           <w:highlight w:val="lightGray"/>
         </w:rPr>
-        <w:t xml:space="preserve">: Persons Table -&gt; ID Column: 1, Name_En Column: Motasem Essam] -&gt; </w:t>
+        <w:t xml:space="preserve">: Persons Table -&gt; ID Column: 1, </w:t>
+      </w:r>
+      <w:proofErr w:type="spellStart"/>
+      <w:r>
+        <w:rPr>
+          <w:rFonts w:ascii="Arial" w:eastAsia="Arial" w:hAnsi="Arial" w:cs="Arial"/>
+          <w:color w:val="000000"/>
+          <w:sz w:val="18"/>
+          <w:highlight w:val="lightGray"/>
+        </w:rPr>
+        <w:t>Name_En</w:t>
+      </w:r>
+      <w:proofErr w:type="spellEnd"/>
+      <w:r>
+        <w:rPr>
+          <w:rFonts w:ascii="Arial" w:eastAsia="Arial" w:hAnsi="Arial" w:cs="Arial"/>
+          <w:color w:val="000000"/>
+          <w:sz w:val="18"/>
+          <w:highlight w:val="lightGray"/>
+        </w:rPr>
+        <w:t xml:space="preserve"> Column: Motasem Essam] -&gt; </w:t>
       </w:r>
       <w:r>
         <w:rPr>
@@ -5694,7 +6143,7 @@
           <w:sz w:val="18"/>
           <w:highlight w:val="lightGray"/>
         </w:rPr>
-        <w:t xml:space="preserve"> [7/15/2026]</w:t>
+        <w:t xml:space="preserve"> [7/11/2026]</w:t>
       </w:r>
     </w:p>
     <w:p>
@@ -6043,7 +6492,7 @@
           <w:rFonts w:ascii="Roboto Mono" w:hAnsi="Roboto Mono"/>
         </w:rPr>
         <w:pict w14:anchorId="2BC007D3">
-          <v:rect id="_x0000_i1261" style="width:0;height:1.5pt" o:hralign="center" o:hrstd="t" o:hr="t" fillcolor="#a0a0a0" stroked="f"/>
+          <v:rect id="_x0000_i1057" style="width:0;height:1.5pt" o:hralign="center" o:hrstd="t" o:hr="t" fillcolor="#a0a0a0" stroked="f"/>
         </w:pict>
       </w:r>
     </w:p>
@@ -6080,7 +6529,27 @@
           <w:sz w:val="18"/>
           <w:highlight w:val="lightGray"/>
         </w:rPr>
-        <w:t xml:space="preserve">: Persons Table -&gt; ID Column: 1, Name_En Column: Motasem Essam] -&gt; </w:t>
+        <w:t xml:space="preserve">: Persons Table -&gt; ID Column: 1, </w:t>
+      </w:r>
+      <w:proofErr w:type="spellStart"/>
+      <w:r>
+        <w:rPr>
+          <w:rFonts w:ascii="Arial" w:eastAsia="Arial" w:hAnsi="Arial" w:cs="Arial"/>
+          <w:color w:val="000000"/>
+          <w:sz w:val="18"/>
+          <w:highlight w:val="lightGray"/>
+        </w:rPr>
+        <w:t>Name_En</w:t>
+      </w:r>
+      <w:proofErr w:type="spellEnd"/>
+      <w:r>
+        <w:rPr>
+          <w:rFonts w:ascii="Arial" w:eastAsia="Arial" w:hAnsi="Arial" w:cs="Arial"/>
+          <w:color w:val="000000"/>
+          <w:sz w:val="18"/>
+          <w:highlight w:val="lightGray"/>
+        </w:rPr>
+        <w:t xml:space="preserve"> Column: Motasem Essam] -&gt; </w:t>
       </w:r>
       <w:r>
         <w:rPr>
@@ -6118,7 +6587,7 @@
           <w:sz w:val="18"/>
           <w:highlight w:val="lightGray"/>
         </w:rPr>
-        <w:t xml:space="preserve"> [7/15/2026]</w:t>
+        <w:t xml:space="preserve"> [7/11/2026]</w:t>
       </w:r>
     </w:p>
     <w:p>
@@ -6454,7 +6923,7 @@
           <w:rFonts w:ascii="Roboto Mono" w:hAnsi="Roboto Mono"/>
         </w:rPr>
         <w:pict w14:anchorId="00F8FE53">
-          <v:rect id="_x0000_i1262" style="width:0;height:1.5pt" o:hralign="center" o:hrstd="t" o:hr="t" fillcolor="#a0a0a0" stroked="f"/>
+          <v:rect id="_x0000_i1058" style="width:0;height:1.5pt" o:hralign="center" o:hrstd="t" o:hr="t" fillcolor="#a0a0a0" stroked="f"/>
         </w:pict>
       </w:r>
     </w:p>
@@ -6484,7 +6953,27 @@
           <w:sz w:val="18"/>
           <w:highlight w:val="lightGray"/>
         </w:rPr>
-        <w:t xml:space="preserve">: Persons Table -&gt; ID Column: 1, Name_En Column: Motasem Essam] -&gt; </w:t>
+        <w:t xml:space="preserve">: Persons Table -&gt; ID Column: 1, </w:t>
+      </w:r>
+      <w:proofErr w:type="spellStart"/>
+      <w:r>
+        <w:rPr>
+          <w:rFonts w:ascii="Arial" w:eastAsia="Arial" w:hAnsi="Arial" w:cs="Arial"/>
+          <w:color w:val="000000"/>
+          <w:sz w:val="18"/>
+          <w:highlight w:val="lightGray"/>
+        </w:rPr>
+        <w:t>Name_En</w:t>
+      </w:r>
+      <w:proofErr w:type="spellEnd"/>
+      <w:r>
+        <w:rPr>
+          <w:rFonts w:ascii="Arial" w:eastAsia="Arial" w:hAnsi="Arial" w:cs="Arial"/>
+          <w:color w:val="000000"/>
+          <w:sz w:val="18"/>
+          <w:highlight w:val="lightGray"/>
+        </w:rPr>
+        <w:t xml:space="preserve"> Column: Motasem Essam] -&gt; </w:t>
       </w:r>
       <w:r>
         <w:rPr>
@@ -6522,7 +7011,7 @@
           <w:sz w:val="18"/>
           <w:highlight w:val="lightGray"/>
         </w:rPr>
-        <w:t xml:space="preserve"> [7/15/2026]</w:t>
+        <w:t xml:space="preserve"> [7/11/2026]</w:t>
       </w:r>
     </w:p>
     <w:p>
@@ -6605,7 +7094,7 @@
 </file>
 
 <file path=word/numbering.xml><?xml version="1.0" encoding="utf-8"?>
-<w:numbering xmlns:wpc="http://schemas.microsoft.com/office/word/2010/wordprocessingCanvas" xmlns:cx="http://schemas.microsoft.com/office/drawing/2014/chartex" xmlns:cx1="http://schemas.microsoft.com/office/drawing/2015/9/8/chartex" xmlns:cx2="http://schemas.microsoft.com/office/drawing/2015/10/21/chartex" xmlns:cx3="http://schemas.microsoft.com/office/drawing/2016/5/9/chartex" xmlns:cx4="http://schemas.microsoft.com/office/drawing/2016/5/10/chartex" xmlns:cx5="http://schemas.microsoft.com/office/drawing/2016/5/11/chartex" xmlns:cx6="http://schemas.microsoft.com/office/drawing/2016/5/12/chartex" xmlns:cx7="http://schemas.microsoft.com/office/drawing/2016/5/13/chartex" xmlns:cx8="http://schemas.microsoft.com/office/drawing/2016/5/14/chartex" xmlns:mc="http://schemas.openxmlformats.org/markup-compatibility/2006" xmlns:aink="http://schemas.microsoft.com/office/drawing/2016/ink" xmlns:am3d="http://schemas.microsoft.com/office/drawing/2017/model3d" xmlns:o="urn:schemas-microsoft-com:office:office" xmlns:oel="http://schemas.microsoft.com/office/2019/extlst" xmlns:r="http://schemas.openxmlformats.org/officeDocument/2006/relationships" xmlns:m="http://schemas.openxmlformats.org/officeDocument/2006/math" xmlns:v="urn:schemas-microsoft-com:vml" xmlns:wp14="http://schemas.microsoft.com/office/word/2010/wordprocessingDrawing" xmlns:wp="http://schemas.openxmlformats.org/drawingml/2006/wordprocessingDrawing" xmlns:w10="urn:schemas-microsoft-com:office:word" xmlns:w="http://schemas.openxmlformats.org/wordprocessingml/2006/main" xmlns:w14="http://schemas.microsoft.com/office/word/2010/wordml" xmlns:w15="http://schemas.microsoft.com/office/word/2012/wordml" xmlns:w16cex="http://schemas.microsoft.com/office/word/2018/wordml/cex" xmlns:w16cid="http://schemas.microsoft.com/office/word/2016/wordml/cid" xmlns:w16="http://schemas.microsoft.com/office/word/2018/wordml" xmlns:w16du="http://schemas.microsoft.com/office/word/2023/wordml/word16du" xmlns:w16sdtdh="http://schemas.microsoft.com/office/word/2020/wordml/sdtdatahash" xmlns:w16sdtfl="http://schemas.microsoft.com/office/word/2024/wordml/sdtformatlock" xmlns:w16se="http://schemas.microsoft.com/office/word/2015/wordml/symex" xmlns:wpg="http://schemas.microsoft.com/office/word/2010/wordprocessingGroup" xmlns:wpi="http://schemas.microsoft.com/office/word/2010/wordprocessingInk" xmlns:wne="http://schemas.microsoft.com/office/word/2006/wordml" xmlns:wps="http://schemas.microsoft.com/office/word/2010/wordprocessingShape" mc:Ignorable="w14 w15 w16se w16cid w16 w16cex w16sdtdh w16sdtfl w16du wp14">
+<w:numbering xmlns:wpc="http://schemas.microsoft.com/office/word/2010/wordprocessingCanvas" xmlns:cx="http://schemas.microsoft.com/office/drawing/2014/chartex" xmlns:cx1="http://schemas.microsoft.com/office/drawing/2015/9/8/chartex" xmlns:cx2="http://schemas.microsoft.com/office/drawing/2015/10/21/chartex" xmlns:cx3="http://schemas.microsoft.com/office/drawing/2016/5/9/chartex" xmlns:cx4="http://schemas.microsoft.com/office/drawing/2016/5/10/chartex" xmlns:cx5="http://schemas.microsoft.com/office/drawing/2016/5/11/chartex" xmlns:cx6="http://schemas.microsoft.com/office/drawing/2016/5/12/chartex" xmlns:cx7="http://schemas.microsoft.com/office/drawing/2016/5/13/chartex" xmlns:cx8="http://schemas.microsoft.com/office/drawing/2016/5/14/chartex" xmlns:mc="http://schemas.openxmlformats.org/markup-compatibility/2006" xmlns:aink="http://schemas.microsoft.com/office/drawing/2016/ink" xmlns:am3d="http://schemas.microsoft.com/office/drawing/2017/model3d" xmlns:o="urn:schemas-microsoft-com:office:office" xmlns:oel="http://schemas.microsoft.com/office/2019/extlst" xmlns:r="http://schemas.openxmlformats.org/officeDocument/2006/relationships" xmlns:m="http://schemas.openxmlformats.org/officeDocument/2006/math" xmlns:v="urn:schemas-microsoft-com:vml" xmlns:wp14="http://schemas.microsoft.com/office/word/2010/wordprocessingDrawing" xmlns:wp="http://schemas.openxmlformats.org/drawingml/2006/wordprocessingDrawing" xmlns:w10="urn:schemas-microsoft-com:office:word" xmlns:w="http://schemas.openxmlformats.org/wordprocessingml/2006/main" xmlns:w14="http://schemas.microsoft.com/office/word/2010/wordml" xmlns:w15="http://schemas.microsoft.com/office/word/2012/wordml" xmlns:w16cei="http://schemas.microsoft.com/office/word/2026/wordml/cei" xmlns:w16cex="http://schemas.microsoft.com/office/word/2018/wordml/cex" xmlns:w16cid="http://schemas.microsoft.com/office/word/2016/wordml/cid" xmlns:w16="http://schemas.microsoft.com/office/word/2018/wordml" xmlns:w16du="http://schemas.microsoft.com/office/word/2023/wordml/word16du" xmlns:w16sdtdh="http://schemas.microsoft.com/office/word/2020/wordml/sdtdatahash" xmlns:w16sdtfl="http://schemas.microsoft.com/office/word/2024/wordml/sdtformatlock" xmlns:w16se="http://schemas.microsoft.com/office/word/2015/wordml/symex" xmlns:wpg="http://schemas.microsoft.com/office/word/2010/wordprocessingGroup" xmlns:wpi="http://schemas.microsoft.com/office/word/2010/wordprocessingInk" xmlns:wne="http://schemas.microsoft.com/office/word/2006/wordml" xmlns:wps="http://schemas.microsoft.com/office/word/2010/wordprocessingShape" mc:Ignorable="w14 w15 w16se w16cid w16 w16cex w16sdtdh w16sdtfl w16du wp14">
   <w:abstractNum w:abstractNumId="0" w15:restartNumberingAfterBreak="0">
     <w:nsid w:val="078A5873"/>
     <w:multiLevelType w:val="multilevel"/>
@@ -8578,6 +9067,7 @@
   <w:style w:type="character" w:default="1" w:styleId="DefaultParagraphFont">
     <w:name w:val="Default Paragraph Font"/>
     <w:uiPriority w:val="1"/>
+    <w:semiHidden/>
     <w:unhideWhenUsed/>
   </w:style>
   <w:style w:type="table" w:default="1" w:styleId="TableNormal">

</xml_diff>